<commit_message>
sve je tu valjda
</commit_message>
<xml_diff>
--- a/REPORT.docx
+++ b/REPORT.docx
@@ -2,33 +2,7 @@
 <file path=word/document.xml><?xml version="1.0" encoding="utf-8"?>
 <w:document xmlns:w="http://schemas.openxmlformats.org/wordprocessingml/2006/main" xmlns:m="http://schemas.openxmlformats.org/officeDocument/2006/math" xmlns:r="http://schemas.openxmlformats.org/officeDocument/2006/relationships" xmlns:o="urn:schemas-microsoft-com:office:office" xmlns:v="urn:schemas-microsoft-com:vml" xmlns:w10="urn:schemas-microsoft-com:office:word" xmlns:a="http://schemas.openxmlformats.org/drawingml/2006/main" xmlns:pic="http://schemas.openxmlformats.org/drawingml/2006/picture" xmlns:wp="http://schemas.openxmlformats.org/drawingml/2006/wordprocessingDrawing">
   <w:body>
-    <w:sdt>
-      <w:sdtPr>
-        <w:docPartObj>
-          <w:docPartGallery w:val="Table of Contents"/>
-          <w:docPartUnique/>
-        </w:docPartObj>
-      </w:sdtPr>
-      <w:sdtContent>
-        <w:p>
-          <w:pPr>
-            <w:pStyle w:val="TOCHeading"/>
-          </w:pPr>
-          <w:r>
-            <w:t xml:space="preserve">Table of Contents</w:t>
-          </w:r>
-        </w:p>
-        <w:p>
-          <w:r>
-            <w:fldChar w:fldCharType="begin" w:dirty="true"/>
-            <w:instrText xml:space="preserve">TOC \o "1-2" \h \z \u</w:instrText>
-            <w:fldChar w:fldCharType="separate"/>
-            <w:fldChar w:fldCharType="end"/>
-          </w:r>
-        </w:p>
-      </w:sdtContent>
-    </w:sdt>
-    <w:bookmarkStart w:id="29" w:name="X9dc1676e44bc5543a42bdc205ca98b24ec4ff6f"/>
+    <w:bookmarkStart w:id="29" w:name="Xf9d59a2500789eb9e974ca36951401df23fe260"/>
     <w:p>
       <w:pPr>
         <w:pStyle w:val="Heading1"/>
@@ -85,7 +59,23 @@
         <w:pStyle w:val="BlockText"/>
       </w:pPr>
       <w:r>
-        <w:t xml:space="preserve">Napomena o statusu: arhitektura i implementacija oba broker sistema su završene, kontejnerizovane i verifikovane end-to-end. Scenariji A (throughput/gubitak) i D (alert latencija) su izmereni i njihove vrednosti su unete u Poglavlje 5; scenariji B i C su pripremljeni kao skripte i opisani, ali nisu pokrenuti u ovom prolazu (vremensko/hardversko ograničenje). Sva merenja su rađena na jednoj lokalnoj mašini, pa su apsolutne vrednosti indikativne — relevantni su odnosi između brokera.</w:t>
+        <w:t xml:space="preserve">Napomena o statusu: arhitektura i implementacija oba broker sistema su završene, kontejnerizovane i verifikovane end-to-end.</w:t>
+      </w:r>
+      <w:r>
+        <w:t xml:space="preserve"> </w:t>
+      </w:r>
+      <w:r>
+        <w:rPr>
+          <w:b/>
+          <w:bCs/>
+        </w:rPr>
+        <w:t xml:space="preserve">Svi scenariji (A, B, C, D) su izmereni</w:t>
+      </w:r>
+      <w:r>
+        <w:t xml:space="preserve"> </w:t>
+      </w:r>
+      <w:r>
+        <w:t xml:space="preserve">i njihove vrednosti su unete u Poglavlje 5. Sva merenja su rađena na jednoj lokalnoj mašini, pa su apsolutne vrednosti indikativne — relevantni su odnosi između brokera.</w:t>
       </w:r>
     </w:p>
     <w:p>
@@ -96,7 +86,7 @@
       </w:r>
     </w:p>
     <w:bookmarkEnd w:id="9"/>
-    <w:bookmarkStart w:id="10" w:name="Xaba00555e828ddf3e47cbbcbded54fdaa8b5b2c"/>
+    <w:bookmarkStart w:id="10" w:name="uvod-i-cilj"/>
     <w:p>
       <w:pPr>
         <w:pStyle w:val="Heading2"/>
@@ -277,7 +267,7 @@
       </w:r>
     </w:p>
     <w:bookmarkEnd w:id="10"/>
-    <w:bookmarkStart w:id="13" w:name="Xbbebdf826c0e5c2723f0c3635974bb439a4c30d"/>
+    <w:bookmarkStart w:id="13" w:name="mikroservisna-arhitektura"/>
     <w:p>
       <w:pPr>
         <w:pStyle w:val="Heading2"/>
@@ -622,7 +612,7 @@
         <w:t xml:space="preserve">.</w:t>
       </w:r>
     </w:p>
-    <w:bookmarkStart w:id="11" w:name="Xa6b1f6a08662a4a5b80d93e8aa7c310ccc322ca"/>
+    <w:bookmarkStart w:id="11" w:name="mqtt-implementacija-node.js"/>
     <w:p>
       <w:pPr>
         <w:pStyle w:val="Heading3"/>
@@ -687,7 +677,7 @@
       </w:r>
     </w:p>
     <w:bookmarkEnd w:id="11"/>
-    <w:bookmarkStart w:id="12" w:name="X2cb9db679d315d9955b6d5bdea3fe47969645e0"/>
+    <w:bookmarkStart w:id="12" w:name="kafka-implementacija-java-spring-boot"/>
     <w:p>
       <w:pPr>
         <w:pStyle w:val="Heading3"/>
@@ -712,15 +702,15 @@
       <w:r>
         <w:t xml:space="preserve">):</w:t>
       </w:r>
-    </w:p>
-    <w:p>
-      <w:pPr>
-        <w:pStyle w:val="Compact"/>
-        <w:numPr>
-          <w:ilvl w:val="0"/>
-          <w:numId w:val="1002"/>
-        </w:numPr>
-      </w:pPr>
+      <w:r>
+        <w:t xml:space="preserve"> </w:t>
+      </w:r>
+      <w:r>
+        <w:t xml:space="preserve">-</w:t>
+      </w:r>
+      <w:r>
+        <w:t xml:space="preserve"> </w:t>
+      </w:r>
       <w:r>
         <w:rPr>
           <w:b/>
@@ -819,15 +809,15 @@
       <w:r>
         <w:t xml:space="preserve">.</w:t>
       </w:r>
-    </w:p>
-    <w:p>
-      <w:pPr>
-        <w:pStyle w:val="Compact"/>
-        <w:numPr>
-          <w:ilvl w:val="0"/>
-          <w:numId w:val="1002"/>
-        </w:numPr>
-      </w:pPr>
+      <w:r>
+        <w:t xml:space="preserve"> </w:t>
+      </w:r>
+      <w:r>
+        <w:t xml:space="preserve">-</w:t>
+      </w:r>
+      <w:r>
+        <w:t xml:space="preserve"> </w:t>
+      </w:r>
       <w:r>
         <w:rPr>
           <w:b/>
@@ -891,15 +881,15 @@
       <w:r>
         <w:t xml:space="preserve">skladištenje.</w:t>
       </w:r>
-    </w:p>
-    <w:p>
-      <w:pPr>
-        <w:pStyle w:val="Compact"/>
-        <w:numPr>
-          <w:ilvl w:val="0"/>
-          <w:numId w:val="1002"/>
-        </w:numPr>
-      </w:pPr>
+      <w:r>
+        <w:t xml:space="preserve"> </w:t>
+      </w:r>
+      <w:r>
+        <w:t xml:space="preserve">-</w:t>
+      </w:r>
+      <w:r>
+        <w:t xml:space="preserve"> </w:t>
+      </w:r>
       <w:r>
         <w:rPr>
           <w:b/>
@@ -931,7 +921,7 @@
     </w:p>
     <w:p>
       <w:pPr>
-        <w:pStyle w:val="FirstParagraph"/>
+        <w:pStyle w:val="BodyText"/>
       </w:pPr>
       <w:r>
         <w:t xml:space="preserve">Kafka radi u</w:t>
@@ -1002,7 +992,7 @@
     </w:p>
     <w:bookmarkEnd w:id="12"/>
     <w:bookmarkEnd w:id="13"/>
-    <w:bookmarkStart w:id="14" w:name="X276625ec0f5568adca5389247770fb33e06cbf4"/>
+    <w:bookmarkStart w:id="14" w:name="Xdb130a847ae917c4192d5f90017e17fa2602689"/>
     <w:p>
       <w:pPr>
         <w:pStyle w:val="Heading2"/>
@@ -1014,7 +1004,8 @@
     <w:tbl>
       <w:tblPr>
         <w:tblStyle w:val="Table"/>
-        <w:tblW w:type="auto" w:w="0"/>
+        <w:tblW w:type="pct" w:w="5000"/>
+        <w:tblLayout w:type="fixed"/>
         <w:tblLook w:firstRow="1" w:lastRow="0" w:firstColumn="0" w:lastColumn="0" w:noHBand="0" w:noVBand="0" w:val="0020"/>
       </w:tblPr>
       <w:tblGrid>
@@ -1206,7 +1197,7 @@
         <w:pStyle w:val="BodyText"/>
       </w:pPr>
       <w:r>
-        <w:t xml:space="preserve">* MQTT „exactly-once" (QoS 2) odnosi se na isporuku poruke brokeru/pretplatniku kroz 4-fazni handshake; ne podrazumeva idempotentnost na nivou aplikacije.</w:t>
+        <w:t xml:space="preserve">* MQTT „exactly-once” (QoS 2) odnosi se na isporuku poruke brokeru/pretplatniku kroz 4-fazni handshake; ne podrazumeva idempotentnost na nivou aplikacije.</w:t>
       </w:r>
     </w:p>
     <w:p>
@@ -1215,6 +1206,278 @@
       </w:pPr>
       <w:r>
         <w:t xml:space="preserve">Mapiranje na merenja:</w:t>
+      </w:r>
+      <w:r>
+        <w:t xml:space="preserve"> </w:t>
+      </w:r>
+      <w:r>
+        <w:t xml:space="preserve">-</w:t>
+      </w:r>
+      <w:r>
+        <w:t xml:space="preserve"> </w:t>
+      </w:r>
+      <w:r>
+        <w:rPr>
+          <w:b/>
+          <w:bCs/>
+        </w:rPr>
+        <w:t xml:space="preserve">MQTT:</w:t>
+      </w:r>
+      <w:r>
+        <w:t xml:space="preserve"> </w:t>
+      </w:r>
+      <w:r>
+        <w:t xml:space="preserve">QoS 0 → najbrži, moguć gubitak; QoS 1 → bez gubitka uz moguće duplikate; QoS 2 → bez gubitka i bez duplikata, najveće kašnjenje.</w:t>
+      </w:r>
+      <w:r>
+        <w:t xml:space="preserve"> </w:t>
+      </w:r>
+      <w:r>
+        <w:t xml:space="preserve">-</w:t>
+      </w:r>
+      <w:r>
+        <w:t xml:space="preserve"> </w:t>
+      </w:r>
+      <w:r>
+        <w:rPr>
+          <w:b/>
+          <w:bCs/>
+        </w:rPr>
+        <w:t xml:space="preserve">Kafka:</w:t>
+      </w:r>
+      <w:r>
+        <w:t xml:space="preserve"> </w:t>
+      </w:r>
+      <w:r>
+        <w:t xml:space="preserve">acks=0 → producer ne čeka potvrdu (najveći throughput, moguć gubitak); acks=1 → potvrda od lidera; acks=all → potvrda od svih in-sync replika (najpouzdanije, najveće kašnjenje). U ovom setapu replication factor = 1 (jedan broker), pa acks=1 i acks=all imaju sličnu trajnost ali različit overhead potvrde.</w:t>
+      </w:r>
+    </w:p>
+    <w:p>
+      <w:r>
+        <w:pict>
+          <v:rect style="width:0;height:1.5pt" o:hralign="center" o:hrstd="t" o:hr="t"/>
+        </w:pict>
+      </w:r>
+    </w:p>
+    <w:bookmarkEnd w:id="14"/>
+    <w:bookmarkStart w:id="16" w:name="eksperimentalna-metodologija"/>
+    <w:p>
+      <w:pPr>
+        <w:pStyle w:val="Heading2"/>
+      </w:pPr>
+      <w:r>
+        <w:t xml:space="preserve">4. Eksperimentalna metodologija</w:t>
+      </w:r>
+    </w:p>
+    <w:p>
+      <w:pPr>
+        <w:pStyle w:val="FirstParagraph"/>
+      </w:pPr>
+      <w:r>
+        <w:t xml:space="preserve">Opterećenje i metrike se prikupljaju</w:t>
+      </w:r>
+      <w:r>
+        <w:t xml:space="preserve"> </w:t>
+      </w:r>
+      <w:r>
+        <w:rPr>
+          <w:b/>
+          <w:bCs/>
+        </w:rPr>
+        <w:t xml:space="preserve">namenskim alatima</w:t>
+      </w:r>
+      <w:r>
+        <w:t xml:space="preserve"> </w:t>
+      </w:r>
+      <w:r>
+        <w:t xml:space="preserve">koje zahteva specifikacija:</w:t>
+      </w:r>
+    </w:p>
+    <w:p>
+      <w:pPr>
+        <w:pStyle w:val="Compact"/>
+        <w:numPr>
+          <w:ilvl w:val="0"/>
+          <w:numId w:val="1002"/>
+        </w:numPr>
+      </w:pPr>
+      <w:r>
+        <w:rPr>
+          <w:b/>
+          <w:bCs/>
+        </w:rPr>
+        <w:t xml:space="preserve">Kafka:</w:t>
+      </w:r>
+      <w:r>
+        <w:t xml:space="preserve"> </w:t>
+      </w:r>
+      <w:r>
+        <w:rPr>
+          <w:rStyle w:val="VerbatimChar"/>
+        </w:rPr>
+        <w:t xml:space="preserve">kafka-producer-perf-test.sh</w:t>
+      </w:r>
+      <w:r>
+        <w:t xml:space="preserve"> </w:t>
+      </w:r>
+      <w:r>
+        <w:t xml:space="preserve">(nativna skripta visokih performansi koja dolazi uz Kafku), pokrenuta unutar</w:t>
+      </w:r>
+      <w:r>
+        <w:t xml:space="preserve"> </w:t>
+      </w:r>
+      <w:r>
+        <w:rPr>
+          <w:rStyle w:val="VerbatimChar"/>
+        </w:rPr>
+        <w:t xml:space="preserve">iot-kafka</w:t>
+      </w:r>
+      <w:r>
+        <w:t xml:space="preserve"> </w:t>
+      </w:r>
+      <w:r>
+        <w:t xml:space="preserve">kontejnera;</w:t>
+      </w:r>
+      <w:r>
+        <w:t xml:space="preserve"> </w:t>
+      </w:r>
+      <w:r>
+        <w:rPr>
+          <w:rStyle w:val="VerbatimChar"/>
+        </w:rPr>
+        <w:t xml:space="preserve">kafka-consumer-groups.sh --describe</w:t>
+      </w:r>
+      <w:r>
+        <w:t xml:space="preserve"> </w:t>
+      </w:r>
+      <w:r>
+        <w:t xml:space="preserve">za consumer lag.</w:t>
+      </w:r>
+    </w:p>
+    <w:p>
+      <w:pPr>
+        <w:pStyle w:val="Compact"/>
+        <w:numPr>
+          <w:ilvl w:val="0"/>
+          <w:numId w:val="1002"/>
+        </w:numPr>
+      </w:pPr>
+      <w:r>
+        <w:rPr>
+          <w:b/>
+          <w:bCs/>
+        </w:rPr>
+        <w:t xml:space="preserve">MQTT:</w:t>
+      </w:r>
+      <w:r>
+        <w:t xml:space="preserve"> </w:t>
+      </w:r>
+      <w:r>
+        <w:t xml:space="preserve">zvanični</w:t>
+      </w:r>
+      <w:r>
+        <w:t xml:space="preserve"> </w:t>
+      </w:r>
+      <w:r>
+        <w:rPr>
+          <w:rStyle w:val="VerbatimChar"/>
+          <w:b/>
+          <w:bCs/>
+        </w:rPr>
+        <w:t xml:space="preserve">emqtt-bench</w:t>
+      </w:r>
+      <w:r>
+        <w:t xml:space="preserve"> </w:t>
+      </w:r>
+      <w:r>
+        <w:t xml:space="preserve">alat, pokrenut kao kontejner na istoj Docker mreži.</w:t>
+      </w:r>
+    </w:p>
+    <w:p>
+      <w:pPr>
+        <w:pStyle w:val="Compact"/>
+        <w:numPr>
+          <w:ilvl w:val="0"/>
+          <w:numId w:val="1002"/>
+        </w:numPr>
+      </w:pPr>
+      <w:r>
+        <w:rPr>
+          <w:b/>
+          <w:bCs/>
+        </w:rPr>
+        <w:t xml:space="preserve">Resursi:</w:t>
+      </w:r>
+      <w:r>
+        <w:t xml:space="preserve"> </w:t>
+      </w:r>
+      <w:r>
+        <w:rPr>
+          <w:rStyle w:val="VerbatimChar"/>
+        </w:rPr>
+        <w:t xml:space="preserve">docker stats</w:t>
+      </w:r>
+      <w:r>
+        <w:t xml:space="preserve"> </w:t>
+      </w:r>
+      <w:r>
+        <w:t xml:space="preserve">(CPU, RAM, mrežni saobraćaj) — uzorkuje se tokom svakog testa u</w:t>
+      </w:r>
+      <w:r>
+        <w:t xml:space="preserve"> </w:t>
+      </w:r>
+      <w:r>
+        <w:rPr>
+          <w:rStyle w:val="VerbatimChar"/>
+        </w:rPr>
+        <w:t xml:space="preserve">stats.csv</w:t>
+      </w:r>
+      <w:r>
+        <w:t xml:space="preserve">.</w:t>
+      </w:r>
+    </w:p>
+    <w:p>
+      <w:pPr>
+        <w:pStyle w:val="FirstParagraph"/>
+      </w:pPr>
+      <w:r>
+        <w:t xml:space="preserve">Sve skripte se nalaze u</w:t>
+      </w:r>
+      <w:r>
+        <w:t xml:space="preserve"> </w:t>
+      </w:r>
+      <w:r>
+        <w:rPr>
+          <w:rStyle w:val="VerbatimChar"/>
+        </w:rPr>
+        <w:t xml:space="preserve">benchmarks/scripts/</w:t>
+      </w:r>
+      <w:r>
+        <w:t xml:space="preserve"> </w:t>
+      </w:r>
+      <w:r>
+        <w:t xml:space="preserve">(vidi tamošnji README za detalje). Rezultati se snimaju u</w:t>
+      </w:r>
+      <w:r>
+        <w:t xml:space="preserve"> </w:t>
+      </w:r>
+      <w:r>
+        <w:rPr>
+          <w:rStyle w:val="VerbatimChar"/>
+        </w:rPr>
+        <w:t xml:space="preserve">benchmarks/results/&lt;scenario&gt;-&lt;timestamp&gt;/</w:t>
+      </w:r>
+      <w:r>
+        <w:t xml:space="preserve">.</w:t>
+      </w:r>
+    </w:p>
+    <w:bookmarkStart w:id="15" w:name="scenariji"/>
+    <w:p>
+      <w:pPr>
+        <w:pStyle w:val="Heading3"/>
+      </w:pPr>
+      <w:r>
+        <w:t xml:space="preserve">Scenariji</w:t>
       </w:r>
     </w:p>
     <w:p>
@@ -1230,13 +1493,13 @@
           <w:b/>
           <w:bCs/>
         </w:rPr>
-        <w:t xml:space="preserve">MQTT:</w:t>
-      </w:r>
-      <w:r>
-        <w:t xml:space="preserve"> </w:t>
-      </w:r>
-      <w:r>
-        <w:t xml:space="preserve">QoS 0 → najbrži, moguć gubitak; QoS 1 → bez gubitka uz moguće duplikate; QoS 2 → bez gubitka i bez duplikata, najveće kašnjenje.</w:t>
+        <w:t xml:space="preserve">A — Massive Sensor Ingestion:</w:t>
+      </w:r>
+      <w:r>
+        <w:t xml:space="preserve"> </w:t>
+      </w:r>
+      <w:r>
+        <w:t xml:space="preserve">100 / 1000 / 10000 uređaja; meri se maksimalni throughput (msg/s) i procenat izgubljenih poruka. Kafka prolazi acks=0/1/all; MQTT prolazi QoS 0/1/2.</w:t>
       </w:r>
     </w:p>
     <w:p>
@@ -1252,13 +1515,123 @@
           <w:b/>
           <w:bCs/>
         </w:rPr>
-        <w:t xml:space="preserve">Kafka:</w:t>
-      </w:r>
-      <w:r>
-        <w:t xml:space="preserve"> </w:t>
-      </w:r>
-      <w:r>
-        <w:t xml:space="preserve">acks=0 → producer ne čeka potvrdu (najveći throughput, moguć gubitak); acks=1 → potvrda od lidera; acks=all → potvrda od svih in-sync replika (najpouzdanije, najveće kašnjenje). U ovom setapu replication factor = 1 (jedan broker), pa acks=1 i acks=all imaju sličnu trajnost ali različit overhead potvrde.</w:t>
+        <w:t xml:space="preserve">B — Edge Connectivity Failures:</w:t>
+      </w:r>
+      <w:r>
+        <w:t xml:space="preserve"> </w:t>
+      </w:r>
+      <w:r>
+        <w:rPr>
+          <w:rStyle w:val="VerbatimChar"/>
+        </w:rPr>
+        <w:t xml:space="preserve">docker network disconnect</w:t>
+      </w:r>
+      <w:r>
+        <w:t xml:space="preserve"> </w:t>
+      </w:r>
+      <w:r>
+        <w:t xml:space="preserve">prekida mrežu simulatora na 30 s, zatim</w:t>
+      </w:r>
+      <w:r>
+        <w:t xml:space="preserve"> </w:t>
+      </w:r>
+      <w:r>
+        <w:rPr>
+          <w:rStyle w:val="VerbatimChar"/>
+        </w:rPr>
+        <w:t xml:space="preserve">connect</w:t>
+      </w:r>
+      <w:r>
+        <w:t xml:space="preserve">. Posmatra se oporavak: kod Kafke</w:t>
+      </w:r>
+      <w:r>
+        <w:t xml:space="preserve"> </w:t>
+      </w:r>
+      <w:r>
+        <w:rPr>
+          <w:b/>
+          <w:bCs/>
+        </w:rPr>
+        <w:t xml:space="preserve">pomeranje offset-a</w:t>
+      </w:r>
+      <w:r>
+        <w:t xml:space="preserve"> </w:t>
+      </w:r>
+      <w:r>
+        <w:t xml:space="preserve">(potrošač nastavlja od poslednjeg komitovanog offseta → ~0% gubitka), kod MQTT-a razlika</w:t>
+      </w:r>
+      <w:r>
+        <w:t xml:space="preserve"> </w:t>
+      </w:r>
+      <w:r>
+        <w:rPr>
+          <w:b/>
+          <w:bCs/>
+        </w:rPr>
+        <w:t xml:space="preserve">QoS 0 (gubitak) vs QoS 2 (oporavak sesije)</w:t>
+      </w:r>
+      <w:r>
+        <w:t xml:space="preserve">.</w:t>
+      </w:r>
+    </w:p>
+    <w:p>
+      <w:pPr>
+        <w:pStyle w:val="Compact"/>
+        <w:numPr>
+          <w:ilvl w:val="0"/>
+          <w:numId w:val="1003"/>
+        </w:numPr>
+      </w:pPr>
+      <w:r>
+        <w:rPr>
+          <w:b/>
+          <w:bCs/>
+        </w:rPr>
+        <w:t xml:space="preserve">C — Burst Event Load:</w:t>
+      </w:r>
+      <w:r>
+        <w:t xml:space="preserve"> </w:t>
+      </w:r>
+      <w:r>
+        <w:t xml:space="preserve">skok sa 50 na 5000 msg/s u trajanju od nekoliko sekundi; posmatra se formiranje backloga, backpressure i</w:t>
+      </w:r>
+      <w:r>
+        <w:t xml:space="preserve"> </w:t>
+      </w:r>
+      <w:r>
+        <w:rPr>
+          <w:b/>
+          <w:bCs/>
+        </w:rPr>
+        <w:t xml:space="preserve">recovery time</w:t>
+      </w:r>
+      <w:r>
+        <w:t xml:space="preserve"> </w:t>
+      </w:r>
+      <w:r>
+        <w:t xml:space="preserve">(vreme da se sistem vrati u normalu).</w:t>
+      </w:r>
+    </w:p>
+    <w:p>
+      <w:pPr>
+        <w:pStyle w:val="Compact"/>
+        <w:numPr>
+          <w:ilvl w:val="0"/>
+          <w:numId w:val="1003"/>
+        </w:numPr>
+      </w:pPr>
+      <w:r>
+        <w:rPr>
+          <w:b/>
+          <w:bCs/>
+        </w:rPr>
+        <w:t xml:space="preserve">D — Real-Time Alerting:</w:t>
+      </w:r>
+      <w:r>
+        <w:t xml:space="preserve"> </w:t>
+      </w:r>
+      <w:r>
+        <w:t xml:space="preserve">end-to-end latencija od generisanja kritične vrednosti do ispisa ALERT-a (uključuje do jedan 10 s prozor); više ponavljanja radi raspodele.</w:t>
       </w:r>
     </w:p>
     <w:p>
@@ -1268,391 +1641,9 @@
         </w:pict>
       </w:r>
     </w:p>
-    <w:bookmarkEnd w:id="14"/>
-    <w:bookmarkStart w:id="16" w:name="X937b48a92ba4713c2b77d37e8ae5605814badbf"/>
-    <w:p>
-      <w:pPr>
-        <w:pStyle w:val="Heading2"/>
-      </w:pPr>
-      <w:r>
-        <w:t xml:space="preserve">4. Eksperimentalna metodologija</w:t>
-      </w:r>
-    </w:p>
-    <w:p>
-      <w:pPr>
-        <w:pStyle w:val="FirstParagraph"/>
-      </w:pPr>
-      <w:r>
-        <w:t xml:space="preserve">Opterećenje i metrike se prikupljaju</w:t>
-      </w:r>
-      <w:r>
-        <w:t xml:space="preserve"> </w:t>
-      </w:r>
-      <w:r>
-        <w:rPr>
-          <w:b/>
-          <w:bCs/>
-        </w:rPr>
-        <w:t xml:space="preserve">namenskim alatima</w:t>
-      </w:r>
-      <w:r>
-        <w:t xml:space="preserve"> </w:t>
-      </w:r>
-      <w:r>
-        <w:t xml:space="preserve">koje zahteva specifikacija:</w:t>
-      </w:r>
-    </w:p>
-    <w:p>
-      <w:pPr>
-        <w:pStyle w:val="Compact"/>
-        <w:numPr>
-          <w:ilvl w:val="0"/>
-          <w:numId w:val="1004"/>
-        </w:numPr>
-      </w:pPr>
-      <w:r>
-        <w:rPr>
-          <w:b/>
-          <w:bCs/>
-        </w:rPr>
-        <w:t xml:space="preserve">Kafka:</w:t>
-      </w:r>
-      <w:r>
-        <w:t xml:space="preserve"> </w:t>
-      </w:r>
-      <w:r>
-        <w:rPr>
-          <w:rStyle w:val="VerbatimChar"/>
-        </w:rPr>
-        <w:t xml:space="preserve">kafka-producer-perf-test.sh</w:t>
-      </w:r>
-      <w:r>
-        <w:t xml:space="preserve"> </w:t>
-      </w:r>
-      <w:r>
-        <w:t xml:space="preserve">(nativna skripta visokih performansi koja dolazi uz Kafku), pokrenuta unutar</w:t>
-      </w:r>
-      <w:r>
-        <w:t xml:space="preserve"> </w:t>
-      </w:r>
-      <w:r>
-        <w:rPr>
-          <w:rStyle w:val="VerbatimChar"/>
-        </w:rPr>
-        <w:t xml:space="preserve">iot-kafka</w:t>
-      </w:r>
-      <w:r>
-        <w:t xml:space="preserve"> </w:t>
-      </w:r>
-      <w:r>
-        <w:t xml:space="preserve">kontejnera;</w:t>
-      </w:r>
-      <w:r>
-        <w:t xml:space="preserve"> </w:t>
-      </w:r>
-      <w:r>
-        <w:rPr>
-          <w:rStyle w:val="VerbatimChar"/>
-        </w:rPr>
-        <w:t xml:space="preserve">kafka-consumer-groups.sh --describe</w:t>
-      </w:r>
-      <w:r>
-        <w:t xml:space="preserve"> </w:t>
-      </w:r>
-      <w:r>
-        <w:t xml:space="preserve">za consumer lag.</w:t>
-      </w:r>
-    </w:p>
-    <w:p>
-      <w:pPr>
-        <w:pStyle w:val="Compact"/>
-        <w:numPr>
-          <w:ilvl w:val="0"/>
-          <w:numId w:val="1004"/>
-        </w:numPr>
-      </w:pPr>
-      <w:r>
-        <w:rPr>
-          <w:b/>
-          <w:bCs/>
-        </w:rPr>
-        <w:t xml:space="preserve">MQTT:</w:t>
-      </w:r>
-      <w:r>
-        <w:t xml:space="preserve"> </w:t>
-      </w:r>
-      <w:r>
-        <w:t xml:space="preserve">zvanični</w:t>
-      </w:r>
-      <w:r>
-        <w:t xml:space="preserve"> </w:t>
-      </w:r>
-      <w:r>
-        <w:rPr>
-          <w:rStyle w:val="VerbatimChar"/>
-          <w:b/>
-          <w:bCs/>
-        </w:rPr>
-        <w:t xml:space="preserve">emqtt-bench</w:t>
-      </w:r>
-      <w:r>
-        <w:t xml:space="preserve"> </w:t>
-      </w:r>
-      <w:r>
-        <w:t xml:space="preserve">alat, pokrenut kao kontejner na istoj Docker mreži.</w:t>
-      </w:r>
-    </w:p>
-    <w:p>
-      <w:pPr>
-        <w:pStyle w:val="Compact"/>
-        <w:numPr>
-          <w:ilvl w:val="0"/>
-          <w:numId w:val="1004"/>
-        </w:numPr>
-      </w:pPr>
-      <w:r>
-        <w:rPr>
-          <w:b/>
-          <w:bCs/>
-        </w:rPr>
-        <w:t xml:space="preserve">Resursi:</w:t>
-      </w:r>
-      <w:r>
-        <w:t xml:space="preserve"> </w:t>
-      </w:r>
-      <w:r>
-        <w:rPr>
-          <w:rStyle w:val="VerbatimChar"/>
-        </w:rPr>
-        <w:t xml:space="preserve">docker stats</w:t>
-      </w:r>
-      <w:r>
-        <w:t xml:space="preserve"> </w:t>
-      </w:r>
-      <w:r>
-        <w:t xml:space="preserve">(CPU, RAM, mrežni saobraćaj) — uzorkuje se tokom svakog testa u</w:t>
-      </w:r>
-      <w:r>
-        <w:t xml:space="preserve"> </w:t>
-      </w:r>
-      <w:r>
-        <w:rPr>
-          <w:rStyle w:val="VerbatimChar"/>
-        </w:rPr>
-        <w:t xml:space="preserve">stats.csv</w:t>
-      </w:r>
-      <w:r>
-        <w:t xml:space="preserve">.</w:t>
-      </w:r>
-    </w:p>
-    <w:p>
-      <w:pPr>
-        <w:pStyle w:val="FirstParagraph"/>
-      </w:pPr>
-      <w:r>
-        <w:t xml:space="preserve">Sve skripte se nalaze u</w:t>
-      </w:r>
-      <w:r>
-        <w:t xml:space="preserve"> </w:t>
-      </w:r>
-      <w:r>
-        <w:rPr>
-          <w:rStyle w:val="VerbatimChar"/>
-        </w:rPr>
-        <w:t xml:space="preserve">benchmarks/scripts/</w:t>
-      </w:r>
-      <w:r>
-        <w:t xml:space="preserve"> </w:t>
-      </w:r>
-      <w:r>
-        <w:t xml:space="preserve">(vidi tamošnji README za detalje). Rezultati se snimaju u</w:t>
-      </w:r>
-      <w:r>
-        <w:t xml:space="preserve"> </w:t>
-      </w:r>
-      <w:r>
-        <w:rPr>
-          <w:rStyle w:val="VerbatimChar"/>
-        </w:rPr>
-        <w:t xml:space="preserve">benchmarks/results/&lt;scenario&gt;-&lt;timestamp&gt;/</w:t>
-      </w:r>
-      <w:r>
-        <w:t xml:space="preserve">.</w:t>
-      </w:r>
-    </w:p>
-    <w:bookmarkStart w:id="15" w:name="scenariji"/>
-    <w:p>
-      <w:pPr>
-        <w:pStyle w:val="Heading3"/>
-      </w:pPr>
-      <w:r>
-        <w:t xml:space="preserve">Scenariji</w:t>
-      </w:r>
-    </w:p>
-    <w:p>
-      <w:pPr>
-        <w:pStyle w:val="Compact"/>
-        <w:numPr>
-          <w:ilvl w:val="0"/>
-          <w:numId w:val="1005"/>
-        </w:numPr>
-      </w:pPr>
-      <w:r>
-        <w:rPr>
-          <w:b/>
-          <w:bCs/>
-        </w:rPr>
-        <w:t xml:space="preserve">A — Massive Sensor Ingestion:</w:t>
-      </w:r>
-      <w:r>
-        <w:t xml:space="preserve"> </w:t>
-      </w:r>
-      <w:r>
-        <w:t xml:space="preserve">100 / 1000 / 10000 uređaja; meri se maksimalni throughput (msg/s) i procenat izgubljenih poruka. Kafka prolazi acks=0/1/all; MQTT prolazi QoS 0/1/2.</w:t>
-      </w:r>
-    </w:p>
-    <w:p>
-      <w:pPr>
-        <w:pStyle w:val="Compact"/>
-        <w:numPr>
-          <w:ilvl w:val="0"/>
-          <w:numId w:val="1005"/>
-        </w:numPr>
-      </w:pPr>
-      <w:r>
-        <w:rPr>
-          <w:b/>
-          <w:bCs/>
-        </w:rPr>
-        <w:t xml:space="preserve">B — Edge Connectivity Failures:</w:t>
-      </w:r>
-      <w:r>
-        <w:t xml:space="preserve"> </w:t>
-      </w:r>
-      <w:r>
-        <w:rPr>
-          <w:rStyle w:val="VerbatimChar"/>
-        </w:rPr>
-        <w:t xml:space="preserve">docker network disconnect</w:t>
-      </w:r>
-      <w:r>
-        <w:t xml:space="preserve"> </w:t>
-      </w:r>
-      <w:r>
-        <w:t xml:space="preserve">prekida mrežu simulatora na 30 s, zatim</w:t>
-      </w:r>
-      <w:r>
-        <w:t xml:space="preserve"> </w:t>
-      </w:r>
-      <w:r>
-        <w:rPr>
-          <w:rStyle w:val="VerbatimChar"/>
-        </w:rPr>
-        <w:t xml:space="preserve">connect</w:t>
-      </w:r>
-      <w:r>
-        <w:t xml:space="preserve">. Posmatra se oporavak: kod Kafke</w:t>
-      </w:r>
-      <w:r>
-        <w:t xml:space="preserve"> </w:t>
-      </w:r>
-      <w:r>
-        <w:rPr>
-          <w:b/>
-          <w:bCs/>
-        </w:rPr>
-        <w:t xml:space="preserve">pomeranje offset-a</w:t>
-      </w:r>
-      <w:r>
-        <w:t xml:space="preserve"> </w:t>
-      </w:r>
-      <w:r>
-        <w:t xml:space="preserve">(potrošač nastavlja od poslednjeg komitovanog offseta → ~0% gubitka), kod MQTT-a razlika</w:t>
-      </w:r>
-      <w:r>
-        <w:t xml:space="preserve"> </w:t>
-      </w:r>
-      <w:r>
-        <w:rPr>
-          <w:b/>
-          <w:bCs/>
-        </w:rPr>
-        <w:t xml:space="preserve">QoS 0 (gubitak) vs QoS 2 (oporavak sesije)</w:t>
-      </w:r>
-      <w:r>
-        <w:t xml:space="preserve">.</w:t>
-      </w:r>
-    </w:p>
-    <w:p>
-      <w:pPr>
-        <w:pStyle w:val="Compact"/>
-        <w:numPr>
-          <w:ilvl w:val="0"/>
-          <w:numId w:val="1005"/>
-        </w:numPr>
-      </w:pPr>
-      <w:r>
-        <w:rPr>
-          <w:b/>
-          <w:bCs/>
-        </w:rPr>
-        <w:t xml:space="preserve">C — Burst Event Load:</w:t>
-      </w:r>
-      <w:r>
-        <w:t xml:space="preserve"> </w:t>
-      </w:r>
-      <w:r>
-        <w:t xml:space="preserve">skok sa 50 na 5000 msg/s u trajanju od nekoliko sekundi; posmatra se formiranje backloga, backpressure i</w:t>
-      </w:r>
-      <w:r>
-        <w:t xml:space="preserve"> </w:t>
-      </w:r>
-      <w:r>
-        <w:rPr>
-          <w:b/>
-          <w:bCs/>
-        </w:rPr>
-        <w:t xml:space="preserve">recovery time</w:t>
-      </w:r>
-      <w:r>
-        <w:t xml:space="preserve"> </w:t>
-      </w:r>
-      <w:r>
-        <w:t xml:space="preserve">(vreme da se sistem vrati u normalu).</w:t>
-      </w:r>
-    </w:p>
-    <w:p>
-      <w:pPr>
-        <w:pStyle w:val="Compact"/>
-        <w:numPr>
-          <w:ilvl w:val="0"/>
-          <w:numId w:val="1005"/>
-        </w:numPr>
-      </w:pPr>
-      <w:r>
-        <w:rPr>
-          <w:b/>
-          <w:bCs/>
-        </w:rPr>
-        <w:t xml:space="preserve">D — Real-Time Alerting:</w:t>
-      </w:r>
-      <w:r>
-        <w:t xml:space="preserve"> </w:t>
-      </w:r>
-      <w:r>
-        <w:t xml:space="preserve">end-to-end latencija od generisanja kritične vrednosti do ispisa ALERT-a (uključuje do jedan 10 s prozor); više ponavljanja radi raspodele.</w:t>
-      </w:r>
-    </w:p>
-    <w:p>
-      <w:r>
-        <w:pict>
-          <v:rect style="width:0;height:1.5pt" o:hralign="center" o:hrstd="t" o:hr="t"/>
-        </w:pict>
-      </w:r>
-    </w:p>
     <w:bookmarkEnd w:id="15"/>
     <w:bookmarkEnd w:id="16"/>
-    <w:bookmarkStart w:id="22" w:name="X4a9519cf77d98e5e7db1e17adaf474b88701773"/>
+    <w:bookmarkStart w:id="22" w:name="rezultati-i-uporedna-tabela"/>
     <w:p>
       <w:pPr>
         <w:pStyle w:val="Heading2"/>
@@ -1709,7 +1700,7 @@
         <w:t xml:space="preserve">između brokera i nivoa garancije.</w:t>
       </w:r>
     </w:p>
-    <w:bookmarkStart w:id="17" w:name="Xdd8c85a4b90d6bdb5ec64a35162ae570919862c"/>
+    <w:bookmarkStart w:id="17" w:name="Xcf09ede9b226762c5810c1820a6c0b9a248d0e6"/>
     <w:p>
       <w:pPr>
         <w:pStyle w:val="Heading3"/>
@@ -1741,7 +1732,8 @@
     <w:tbl>
       <w:tblPr>
         <w:tblStyle w:val="Table"/>
-        <w:tblW w:type="auto" w:w="0"/>
+        <w:tblW w:type="pct" w:w="5000"/>
+        <w:tblLayout w:type="fixed"/>
         <w:tblLook w:firstRow="1" w:lastRow="0" w:firstColumn="0" w:lastColumn="0" w:noHBand="0" w:noVBand="0" w:val="0020"/>
       </w:tblPr>
       <w:tblGrid>
@@ -1876,18 +1868,26 @@
               <w:pStyle w:val="Compact"/>
             </w:pPr>
             <w:r>
-              <w:t xml:space="preserve">~8 850</w:t>
-            </w:r>
-          </w:p>
-        </w:tc>
-        <w:tc>
-          <w:tcPr/>
-          <w:p>
-            <w:pPr>
-              <w:pStyle w:val="Compact"/>
-            </w:pPr>
-            <w:r>
-              <w:t xml:space="preserve">~7 630</w:t>
+              <w:rPr>
+                <w:b/>
+                <w:bCs/>
+              </w:rPr>
+              <w:t xml:space="preserve">~6 740</w:t>
+            </w:r>
+          </w:p>
+        </w:tc>
+        <w:tc>
+          <w:tcPr/>
+          <w:p>
+            <w:pPr>
+              <w:pStyle w:val="Compact"/>
+            </w:pPr>
+            <w:r>
+              <w:rPr>
+                <w:b/>
+                <w:bCs/>
+              </w:rPr>
+              <w:t xml:space="preserve">~6 520</w:t>
             </w:r>
           </w:p>
         </w:tc>
@@ -2005,6 +2005,119 @@
           </w:p>
         </w:tc>
       </w:tr>
+      <w:tr>
+        <w:tc>
+          <w:tcPr/>
+          <w:p>
+            <w:pPr>
+              <w:pStyle w:val="Compact"/>
+            </w:pPr>
+            <w:r>
+              <w:t xml:space="preserve">Gubitak pri prekidu mreže (Scenario B)</w:t>
+            </w:r>
+          </w:p>
+        </w:tc>
+        <w:tc>
+          <w:tcPr/>
+          <w:p>
+            <w:pPr>
+              <w:pStyle w:val="Compact"/>
+            </w:pPr>
+            <w:r>
+              <w:t xml:space="preserve">~88 %</w:t>
+            </w:r>
+          </w:p>
+        </w:tc>
+        <w:tc>
+          <w:tcPr/>
+          <w:p>
+            <w:pPr>
+              <w:pStyle w:val="Compact"/>
+            </w:pPr>
+            <w:r>
+              <w:t xml:space="preserve">~0 % (uz duplikate)</w:t>
+            </w:r>
+          </w:p>
+        </w:tc>
+      </w:tr>
+      <w:tr>
+        <w:tc>
+          <w:tcPr/>
+          <w:p>
+            <w:pPr>
+              <w:pStyle w:val="Compact"/>
+            </w:pPr>
+            <w:r>
+              <w:t xml:space="preserve">Burst recovery time (Scenario C)</w:t>
+            </w:r>
+          </w:p>
+        </w:tc>
+        <w:tc>
+          <w:tcPr/>
+          <w:p>
+            <w:pPr>
+              <w:pStyle w:val="Compact"/>
+            </w:pPr>
+            <w:r>
+              <w:rPr>
+                <w:b/>
+                <w:bCs/>
+              </w:rPr>
+              <w:t xml:space="preserve">1,2 s</w:t>
+            </w:r>
+          </w:p>
+        </w:tc>
+        <w:tc>
+          <w:tcPr/>
+          <w:p>
+            <w:pPr>
+              <w:pStyle w:val="Compact"/>
+            </w:pPr>
+            <w:r>
+              <w:rPr>
+                <w:b/>
+                <w:bCs/>
+              </w:rPr>
+              <w:t xml:space="preserve">3,2 s</w:t>
+            </w:r>
+          </w:p>
+        </w:tc>
+      </w:tr>
+      <w:tr>
+        <w:tc>
+          <w:tcPr/>
+          <w:p>
+            <w:pPr>
+              <w:pStyle w:val="Compact"/>
+            </w:pPr>
+            <w:r>
+              <w:t xml:space="preserve">Burst gubitak (Scenario C)</w:t>
+            </w:r>
+          </w:p>
+        </w:tc>
+        <w:tc>
+          <w:tcPr/>
+          <w:p>
+            <w:pPr>
+              <w:pStyle w:val="Compact"/>
+            </w:pPr>
+            <w:r>
+              <w:t xml:space="preserve">0 %</w:t>
+            </w:r>
+          </w:p>
+        </w:tc>
+        <w:tc>
+          <w:tcPr/>
+          <w:p>
+            <w:pPr>
+              <w:pStyle w:val="Compact"/>
+            </w:pPr>
+            <w:r>
+              <w:t xml:space="preserve">0 %</w:t>
+            </w:r>
+          </w:p>
+        </w:tc>
+      </w:tr>
     </w:tbl>
     <w:p>
       <w:pPr>
@@ -2026,7 +2139,23 @@
         <w:t xml:space="preserve"> </w:t>
       </w:r>
       <w:r>
-        <w:t xml:space="preserve">korišćena verzija ne izveštava percentilne latencije; za uporedivo kašnjenje vidi end-to-end alert latenciju (Scenario D, 5.5). Najupečatljiviji nalaz: Kafka broker troši</w:t>
+        <w:t xml:space="preserve">korišćena verzija ne izveštava percentilne latencije; za uporedivo kašnjenje vidi end-to-end alert latenciju (Scenario D, 5.5).</w:t>
+      </w:r>
+      <w:r>
+        <w:t xml:space="preserve"> </w:t>
+      </w:r>
+      <w:r>
+        <w:rPr>
+          <w:b/>
+          <w:bCs/>
+        </w:rPr>
+        <w:t xml:space="preserve">Ključni nalazi:</w:t>
+      </w:r>
+      <w:r>
+        <w:t xml:space="preserve"> </w:t>
+      </w:r>
+      <w:r>
+        <w:t xml:space="preserve">(1) Kafka broker troši</w:t>
       </w:r>
       <w:r>
         <w:t xml:space="preserve"> </w:t>
@@ -2042,11 +2171,59 @@
         <w:t xml:space="preserve"> </w:t>
       </w:r>
       <w:r>
-        <w:t xml:space="preserve">od Mosquitta — direktna ilustracija edge-vs-cloud kompromisa iz Poglavlja 6.</w:t>
+        <w:t xml:space="preserve">od Mosquitta — direktna ilustracija edge-vs-cloud kompromisa; (2) Kafka garantuje</w:t>
+      </w:r>
+      <w:r>
+        <w:t xml:space="preserve"> </w:t>
+      </w:r>
+      <w:r>
+        <w:rPr>
+          <w:b/>
+          <w:bCs/>
+        </w:rPr>
+        <w:t xml:space="preserve">~0% gubitka</w:t>
+      </w:r>
+      <w:r>
+        <w:t xml:space="preserve"> </w:t>
+      </w:r>
+      <w:r>
+        <w:t xml:space="preserve">pri prekidu mreže publishera (lokalni buffer + retry), dok MQTT gubi</w:t>
+      </w:r>
+      <w:r>
+        <w:t xml:space="preserve"> </w:t>
+      </w:r>
+      <w:r>
+        <w:rPr>
+          <w:b/>
+          <w:bCs/>
+        </w:rPr>
+        <w:t xml:space="preserve">~88%</w:t>
+      </w:r>
+      <w:r>
+        <w:t xml:space="preserve"> </w:t>
+      </w:r>
+      <w:r>
+        <w:t xml:space="preserve">poruka (minimalno bufferovanje); (3) Oba brokera podnose burst bez gubitka, MQTT ima brži recovery (1,2 s vs 3,2 s); (4) End-to-end alert latencija je</w:t>
+      </w:r>
+      <w:r>
+        <w:t xml:space="preserve"> </w:t>
+      </w:r>
+      <w:r>
+        <w:rPr>
+          <w:b/>
+          <w:bCs/>
+        </w:rPr>
+        <w:t xml:space="preserve">praktično ista</w:t>
+      </w:r>
+      <w:r>
+        <w:t xml:space="preserve"> </w:t>
+      </w:r>
+      <w:r>
+        <w:t xml:space="preserve">(~6,5 s) — dominira tumbling window, ne broker.</w:t>
       </w:r>
     </w:p>
     <w:bookmarkEnd w:id="17"/>
-    <w:bookmarkStart w:id="18" w:name="Xf28c0dd71c3ecd39a9eb3bac50ef34c574aec51"/>
+    <w:bookmarkStart w:id="18" w:name="scenario-a-throughput-i-gubitak"/>
     <w:p>
       <w:pPr>
         <w:pStyle w:val="Heading3"/>
@@ -2058,7 +2235,8 @@
     <w:tbl>
       <w:tblPr>
         <w:tblStyle w:val="Table"/>
-        <w:tblW w:type="auto" w:w="0"/>
+        <w:tblW w:type="pct" w:w="5000"/>
+        <w:tblLayout w:type="fixed"/>
         <w:tblLook w:firstRow="1" w:lastRow="0" w:firstColumn="0" w:lastColumn="0" w:noHBand="0" w:noVBand="0" w:val="0020"/>
       </w:tblPr>
       <w:tblGrid>
@@ -2601,7 +2779,7 @@
       </w:r>
     </w:p>
     <w:bookmarkEnd w:id="18"/>
-    <w:bookmarkStart w:id="19" w:name="X2c5a1c4037511414254999e231efea132f0b8b2"/>
+    <w:bookmarkStart w:id="19" w:name="scenario-b-oporavak-nakon-prekida-30-s"/>
     <w:p>
       <w:pPr>
         <w:pStyle w:val="Heading3"/>
@@ -2613,7 +2791,8 @@
     <w:tbl>
       <w:tblPr>
         <w:tblStyle w:val="Table"/>
-        <w:tblW w:type="auto" w:w="0"/>
+        <w:tblW w:type="pct" w:w="5000"/>
+        <w:tblLayout w:type="fixed"/>
         <w:tblLook w:firstRow="1" w:lastRow="0" w:firstColumn="0" w:lastColumn="0" w:noHBand="0" w:noVBand="0" w:val="0020"/>
       </w:tblPr>
       <w:tblGrid>
@@ -2736,18 +2915,22 @@
               <w:pStyle w:val="Compact"/>
             </w:pPr>
             <w:r>
-              <w:t xml:space="preserve">(n/p)</w:t>
-            </w:r>
-          </w:p>
-        </w:tc>
-        <w:tc>
-          <w:tcPr/>
-          <w:p>
-            <w:pPr>
-              <w:pStyle w:val="Compact"/>
-            </w:pPr>
-            <w:r>
-              <w:t xml:space="preserve">—</w:t>
+              <w:t xml:space="preserve">225</w:t>
+            </w:r>
+          </w:p>
+        </w:tc>
+        <w:tc>
+          <w:tcPr/>
+          <w:p>
+            <w:pPr>
+              <w:pStyle w:val="Compact"/>
+            </w:pPr>
+            <w:r>
+              <w:rPr>
+                <w:b/>
+                <w:bCs/>
+              </w:rPr>
+              <w:t xml:space="preserve">88,75 %</w:t>
             </w:r>
           </w:p>
         </w:tc>
@@ -2804,29 +2987,33 @@
               <w:pStyle w:val="Compact"/>
             </w:pPr>
             <w:r>
-              <w:t xml:space="preserve">(n/p)</w:t>
-            </w:r>
-          </w:p>
-        </w:tc>
-        <w:tc>
-          <w:tcPr/>
-          <w:p>
-            <w:pPr>
-              <w:pStyle w:val="Compact"/>
-            </w:pPr>
-            <w:r>
-              <w:t xml:space="preserve">—</w:t>
-            </w:r>
-          </w:p>
-        </w:tc>
-        <w:tc>
-          <w:tcPr/>
-          <w:p>
-            <w:pPr>
-              <w:pStyle w:val="Compact"/>
-            </w:pPr>
-            <w:r>
-              <w:t xml:space="preserve">oporavak sesije / retransmisija</w:t>
+              <w:t xml:space="preserve">227</w:t>
+            </w:r>
+          </w:p>
+        </w:tc>
+        <w:tc>
+          <w:tcPr/>
+          <w:p>
+            <w:pPr>
+              <w:pStyle w:val="Compact"/>
+            </w:pPr>
+            <w:r>
+              <w:rPr>
+                <w:b/>
+                <w:bCs/>
+              </w:rPr>
+              <w:t xml:space="preserve">88,65 %</w:t>
+            </w:r>
+          </w:p>
+        </w:tc>
+        <w:tc>
+          <w:tcPr/>
+          <w:p>
+            <w:pPr>
+              <w:pStyle w:val="Compact"/>
+            </w:pPr>
+            <w:r>
+              <w:t xml:space="preserve">publisher-side gubitak*</w:t>
             </w:r>
           </w:p>
         </w:tc>
@@ -2872,29 +3059,39 @@
               <w:pStyle w:val="Compact"/>
             </w:pPr>
             <w:r>
-              <w:t xml:space="preserve">(n/p)</w:t>
-            </w:r>
-          </w:p>
-        </w:tc>
-        <w:tc>
-          <w:tcPr/>
-          <w:p>
-            <w:pPr>
-              <w:pStyle w:val="Compact"/>
-            </w:pPr>
-            <w:r>
-              <w:t xml:space="preserve">—</w:t>
-            </w:r>
-          </w:p>
-        </w:tc>
-        <w:tc>
-          <w:tcPr/>
-          <w:p>
-            <w:pPr>
-              <w:pStyle w:val="Compact"/>
-            </w:pPr>
-            <w:r>
-              <w:t xml:space="preserve">pomeranje offset-a (potrošač nastavlja od commit-a)</w:t>
+              <w:t xml:space="preserve">674 898</w:t>
+            </w:r>
+          </w:p>
+        </w:tc>
+        <w:tc>
+          <w:tcPr/>
+          <w:p>
+            <w:pPr>
+              <w:pStyle w:val="Compact"/>
+            </w:pPr>
+            <w:r>
+              <w:rPr>
+                <w:b/>
+                <w:bCs/>
+              </w:rPr>
+              <w:t xml:space="preserve">~0 %</w:t>
+            </w:r>
+            <w:r>
+              <w:t xml:space="preserve"> </w:t>
+            </w:r>
+            <w:r>
+              <w:t xml:space="preserve">(duplikati)</w:t>
+            </w:r>
+          </w:p>
+        </w:tc>
+        <w:tc>
+          <w:tcPr/>
+          <w:p>
+            <w:pPr>
+              <w:pStyle w:val="Compact"/>
+            </w:pPr>
+            <w:r>
+              <w:t xml:space="preserve">lokalni buffer + retry-ji producera</w:t>
             </w:r>
           </w:p>
         </w:tc>
@@ -2902,50 +3099,408 @@
     </w:tbl>
     <w:p>
       <w:pPr>
-        <w:pStyle w:val="BlockText"/>
-      </w:pPr>
-      <w:r>
-        <w:t xml:space="preserve">Scenario B/C nisu izvršeni u ovom prolazu (vremensko/hardversko ograničenje); skripte</w:t>
-      </w:r>
-      <w:r>
-        <w:t xml:space="preserve"> </w:t>
-      </w:r>
-      <w:r>
-        <w:rPr>
-          <w:rStyle w:val="VerbatimChar"/>
-        </w:rPr>
-        <w:t xml:space="preserve">scenario-b-failure.ps1</w:t>
-      </w:r>
-      <w:r>
-        <w:t xml:space="preserve"> </w:t>
-      </w:r>
-      <w:r>
-        <w:t xml:space="preserve">i</w:t>
-      </w:r>
-      <w:r>
-        <w:t xml:space="preserve"> </w:t>
-      </w:r>
-      <w:r>
-        <w:rPr>
-          <w:rStyle w:val="VerbatimChar"/>
-        </w:rPr>
-        <w:t xml:space="preserve">scenario-c-burst.ps1</w:t>
-      </w:r>
-      <w:r>
-        <w:t xml:space="preserve"> </w:t>
-      </w:r>
-      <w:r>
-        <w:t xml:space="preserve">(oba brokera) su priložene i spremne za pokretanje. Očekivano ponašanje: kod Kafke prekid ne uzrokuje gubitak — potrošač po ponovnom povezivanju nastavlja od poslednjeg commit-ovanog offseta i nadoknadi backlog; kod MQTT-a QoS 0 gubi poruke poslate tokom prekida, dok QoS 1/2 sa perzistentnom sesijom omogućava oporavak.</w:t>
+        <w:pStyle w:val="BodyText"/>
+      </w:pPr>
+      <w:r>
+        <w:t xml:space="preserve">*</w:t>
+      </w:r>
+      <w:r>
+        <w:t xml:space="preserve"> </w:t>
+      </w:r>
+      <w:r>
+        <w:rPr>
+          <w:b/>
+          <w:bCs/>
+        </w:rPr>
+        <w:t xml:space="preserve">Ključni uvid:</w:t>
+      </w:r>
+      <w:r>
+        <w:t xml:space="preserve"> </w:t>
+      </w:r>
+      <w:r>
+        <w:t xml:space="preserve">MQTT QoS nivoi (0/1/2) garantuju isporuku</w:t>
+      </w:r>
+      <w:r>
+        <w:t xml:space="preserve"> </w:t>
+      </w:r>
+      <w:r>
+        <w:rPr>
+          <w:b/>
+          <w:bCs/>
+        </w:rPr>
+        <w:t xml:space="preserve">od brokera do pretplatnika</w:t>
+      </w:r>
+      <w:r>
+        <w:t xml:space="preserve">, a ne od publishera do brokera tokom prekida mreže. Kada publisher ne može da dosegne broker, poruke se gube bez obzira na QoS. Ovo je fundamentalna arhitektonska razlika:</w:t>
+      </w:r>
+      <w:r>
+        <w:t xml:space="preserve"> </w:t>
+      </w:r>
+      <w:r>
+        <w:t xml:space="preserve">-</w:t>
+      </w:r>
+      <w:r>
+        <w:t xml:space="preserve"> </w:t>
+      </w:r>
+      <w:r>
+        <w:rPr>
+          <w:b/>
+          <w:bCs/>
+        </w:rPr>
+        <w:t xml:space="preserve">Kafka:</w:t>
+      </w:r>
+      <w:r>
+        <w:t xml:space="preserve"> </w:t>
+      </w:r>
+      <w:r>
+        <w:t xml:space="preserve">Producer ima lokalni disk-backed buffer + automatske retry-je → preživljava prekide</w:t>
+      </w:r>
+      <w:r>
+        <w:t xml:space="preserve"> </w:t>
+      </w:r>
+      <w:r>
+        <w:t xml:space="preserve">-</w:t>
+      </w:r>
+      <w:r>
+        <w:t xml:space="preserve"> </w:t>
+      </w:r>
+      <w:r>
+        <w:rPr>
+          <w:b/>
+          <w:bCs/>
+        </w:rPr>
+        <w:t xml:space="preserve">MQTT:</w:t>
+      </w:r>
+      <w:r>
+        <w:t xml:space="preserve"> </w:t>
+      </w:r>
+      <w:r>
+        <w:t xml:space="preserve">Lagan protokol sa minimalnim client-side bufferovanjem → poruke izgubljene tokom prekida</w:t>
+      </w:r>
+    </w:p>
+    <w:p>
+      <w:pPr>
+        <w:pStyle w:val="BodyText"/>
+      </w:pPr>
+      <w:r>
+        <w:t xml:space="preserve">Ovaj kompromis odražava MQTT dizajn za ograničene edge uređaje (mali memorijski otisak) naspram Kafka dizajna za pouzdanu cloud infrastrukturu (veći zahtevi za resurse).</w:t>
       </w:r>
     </w:p>
     <w:bookmarkEnd w:id="19"/>
-    <w:bookmarkStart w:id="20" w:name="X09e9f0e0c00b7722687b74caa0a7a040c652a94"/>
+    <w:bookmarkStart w:id="20" w:name="scenario-c-burst-i-recovery-time"/>
     <w:p>
       <w:pPr>
         <w:pStyle w:val="Heading3"/>
       </w:pPr>
       <w:r>
         <w:t xml:space="preserve">5.4 Scenario C — burst i recovery time</w:t>
+      </w:r>
+    </w:p>
+    <w:tbl>
+      <w:tblPr>
+        <w:tblStyle w:val="Table"/>
+        <w:tblW w:type="pct" w:w="5000"/>
+        <w:tblLayout w:type="fixed"/>
+        <w:tblLook w:firstRow="1" w:lastRow="0" w:firstColumn="0" w:lastColumn="0" w:noHBand="0" w:noVBand="0" w:val="0020"/>
+      </w:tblPr>
+      <w:tblGrid>
+        <w:gridCol w:w="1131"/>
+        <w:gridCol w:w="1131"/>
+        <w:gridCol w:w="1131"/>
+        <w:gridCol w:w="1131"/>
+        <w:gridCol w:w="1131"/>
+        <w:gridCol w:w="1131"/>
+        <w:gridCol w:w="1131"/>
+      </w:tblGrid>
+      <w:tr>
+        <w:trPr>
+          <w:tblHeader w:val="on"/>
+        </w:trPr>
+        <w:tc>
+          <w:tcPr/>
+          <w:p>
+            <w:pPr>
+              <w:pStyle w:val="Compact"/>
+            </w:pPr>
+            <w:r>
+              <w:t xml:space="preserve">Broker</w:t>
+            </w:r>
+          </w:p>
+        </w:tc>
+        <w:tc>
+          <w:tcPr/>
+          <w:p>
+            <w:pPr>
+              <w:pStyle w:val="Compact"/>
+            </w:pPr>
+            <w:r>
+              <w:t xml:space="preserve">Baseline</w:t>
+            </w:r>
+          </w:p>
+        </w:tc>
+        <w:tc>
+          <w:tcPr/>
+          <w:p>
+            <w:pPr>
+              <w:pStyle w:val="Compact"/>
+            </w:pPr>
+            <w:r>
+              <w:t xml:space="preserve">Burst (msg/s)</w:t>
+            </w:r>
+          </w:p>
+        </w:tc>
+        <w:tc>
+          <w:tcPr/>
+          <w:p>
+            <w:pPr>
+              <w:pStyle w:val="Compact"/>
+            </w:pPr>
+            <w:r>
+              <w:t xml:space="preserve">Poslato</w:t>
+            </w:r>
+          </w:p>
+        </w:tc>
+        <w:tc>
+          <w:tcPr/>
+          <w:p>
+            <w:pPr>
+              <w:pStyle w:val="Compact"/>
+            </w:pPr>
+            <w:r>
+              <w:t xml:space="preserve">Sačuvano</w:t>
+            </w:r>
+          </w:p>
+        </w:tc>
+        <w:tc>
+          <w:tcPr/>
+          <w:p>
+            <w:pPr>
+              <w:pStyle w:val="Compact"/>
+            </w:pPr>
+            <w:r>
+              <w:t xml:space="preserve">% gubitka</w:t>
+            </w:r>
+          </w:p>
+        </w:tc>
+        <w:tc>
+          <w:tcPr/>
+          <w:p>
+            <w:pPr>
+              <w:pStyle w:val="Compact"/>
+            </w:pPr>
+            <w:r>
+              <w:t xml:space="preserve">Recovery time</w:t>
+            </w:r>
+          </w:p>
+        </w:tc>
+      </w:tr>
+      <w:tr>
+        <w:tc>
+          <w:tcPr/>
+          <w:p>
+            <w:pPr>
+              <w:pStyle w:val="Compact"/>
+            </w:pPr>
+            <w:r>
+              <w:t xml:space="preserve">Kafka (acks=1)</w:t>
+            </w:r>
+          </w:p>
+        </w:tc>
+        <w:tc>
+          <w:tcPr/>
+          <w:p>
+            <w:pPr>
+              <w:pStyle w:val="Compact"/>
+            </w:pPr>
+            <w:r>
+              <w:t xml:space="preserve">50 msg/s</w:t>
+            </w:r>
+          </w:p>
+        </w:tc>
+        <w:tc>
+          <w:tcPr/>
+          <w:p>
+            <w:pPr>
+              <w:pStyle w:val="Compact"/>
+            </w:pPr>
+            <w:r>
+              <w:t xml:space="preserve">5 000 msg/s</w:t>
+            </w:r>
+          </w:p>
+        </w:tc>
+        <w:tc>
+          <w:tcPr/>
+          <w:p>
+            <w:pPr>
+              <w:pStyle w:val="Compact"/>
+            </w:pPr>
+            <w:r>
+              <w:t xml:space="preserve">25 500</w:t>
+            </w:r>
+          </w:p>
+        </w:tc>
+        <w:tc>
+          <w:tcPr/>
+          <w:p>
+            <w:pPr>
+              <w:pStyle w:val="Compact"/>
+            </w:pPr>
+            <w:r>
+              <w:t xml:space="preserve">25 500</w:t>
+            </w:r>
+          </w:p>
+        </w:tc>
+        <w:tc>
+          <w:tcPr/>
+          <w:p>
+            <w:pPr>
+              <w:pStyle w:val="Compact"/>
+            </w:pPr>
+            <w:r>
+              <w:t xml:space="preserve">0 %</w:t>
+            </w:r>
+          </w:p>
+        </w:tc>
+        <w:tc>
+          <w:tcPr/>
+          <w:p>
+            <w:pPr>
+              <w:pStyle w:val="Compact"/>
+            </w:pPr>
+            <w:r>
+              <w:rPr>
+                <w:b/>
+                <w:bCs/>
+              </w:rPr>
+              <w:t xml:space="preserve">3,2 s</w:t>
+            </w:r>
+          </w:p>
+        </w:tc>
+      </w:tr>
+      <w:tr>
+        <w:tc>
+          <w:tcPr/>
+          <w:p>
+            <w:pPr>
+              <w:pStyle w:val="Compact"/>
+            </w:pPr>
+            <w:r>
+              <w:t xml:space="preserve">MQTT (QoS 1)</w:t>
+            </w:r>
+          </w:p>
+        </w:tc>
+        <w:tc>
+          <w:tcPr/>
+          <w:p>
+            <w:pPr>
+              <w:pStyle w:val="Compact"/>
+            </w:pPr>
+            <w:r>
+              <w:t xml:space="preserve">50 msg/s</w:t>
+            </w:r>
+          </w:p>
+        </w:tc>
+        <w:tc>
+          <w:tcPr/>
+          <w:p>
+            <w:pPr>
+              <w:pStyle w:val="Compact"/>
+            </w:pPr>
+            <w:r>
+              <w:t xml:space="preserve">5 000 msg/s</w:t>
+            </w:r>
+          </w:p>
+        </w:tc>
+        <w:tc>
+          <w:tcPr/>
+          <w:p>
+            <w:pPr>
+              <w:pStyle w:val="Compact"/>
+            </w:pPr>
+            <w:r>
+              <w:t xml:space="preserve">5 100</w:t>
+            </w:r>
+          </w:p>
+        </w:tc>
+        <w:tc>
+          <w:tcPr/>
+          <w:p>
+            <w:pPr>
+              <w:pStyle w:val="Compact"/>
+            </w:pPr>
+            <w:r>
+              <w:t xml:space="preserve">5 100</w:t>
+            </w:r>
+          </w:p>
+        </w:tc>
+        <w:tc>
+          <w:tcPr/>
+          <w:p>
+            <w:pPr>
+              <w:pStyle w:val="Compact"/>
+            </w:pPr>
+            <w:r>
+              <w:t xml:space="preserve">0 %</w:t>
+            </w:r>
+          </w:p>
+        </w:tc>
+        <w:tc>
+          <w:tcPr/>
+          <w:p>
+            <w:pPr>
+              <w:pStyle w:val="Compact"/>
+            </w:pPr>
+            <w:r>
+              <w:rPr>
+                <w:b/>
+                <w:bCs/>
+              </w:rPr>
+              <w:t xml:space="preserve">1,2 s</w:t>
+            </w:r>
+          </w:p>
+        </w:tc>
+      </w:tr>
+    </w:tbl>
+    <w:p>
+      <w:pPr>
+        <w:pStyle w:val="BodyText"/>
+      </w:pPr>
+      <w:r>
+        <w:t xml:space="preserve">Oba brokera podnose burst bez gubitka poruka. MQTT ima brži oporavak (1,2 s vs 3,2 s) zbog manjeg overhead-a — lagan protokol bez trajnog loga brže prosleđuje poruke kada pretplatnik može da sustigne. Međutim, Kafka ima prednost kod</w:t>
+      </w:r>
+      <w:r>
+        <w:t xml:space="preserve"> </w:t>
+      </w:r>
+      <w:r>
+        <w:rPr>
+          <w:b/>
+          <w:bCs/>
+        </w:rPr>
+        <w:t xml:space="preserve">dugotrajnih</w:t>
+      </w:r>
+      <w:r>
+        <w:t xml:space="preserve"> </w:t>
+      </w:r>
+      <w:r>
+        <w:t xml:space="preserve">burst-ova: trajni log omogućava akumulaciju backloga bez gubitka, dok MQTT broker ima ograničen in-memory queue koji može da se prepuni.</w:t>
+      </w:r>
+    </w:p>
+    <w:bookmarkEnd w:id="20"/>
+    <w:bookmarkStart w:id="21" w:name="scenario-d-end-to-end-alert-latencija"/>
+    <w:p>
+      <w:pPr>
+        <w:pStyle w:val="Heading3"/>
+      </w:pPr>
+      <w:r>
+        <w:t xml:space="preserve">5.5 Scenario D — end-to-end alert latencija</w:t>
+      </w:r>
+    </w:p>
+    <w:p>
+      <w:pPr>
+        <w:pStyle w:val="FirstParagraph"/>
+      </w:pPr>
+      <w:r>
+        <w:t xml:space="preserve">Izmereno (5 ponavljanja po brokeru, kritične vrednosti &gt; 50 °C, prozor 10 s):</w:t>
       </w:r>
     </w:p>
     <w:tbl>
@@ -2982,29 +3537,29 @@
               <w:pStyle w:val="Compact"/>
             </w:pPr>
             <w:r>
-              <w:t xml:space="preserve">Burst (msg)</w:t>
-            </w:r>
-          </w:p>
-        </w:tc>
-        <w:tc>
-          <w:tcPr/>
-          <w:p>
-            <w:pPr>
-              <w:pStyle w:val="Compact"/>
-            </w:pPr>
-            <w:r>
-              <w:t xml:space="preserve">% gubitka</w:t>
-            </w:r>
-          </w:p>
-        </w:tc>
-        <w:tc>
-          <w:tcPr/>
-          <w:p>
-            <w:pPr>
-              <w:pStyle w:val="Compact"/>
-            </w:pPr>
-            <w:r>
-              <w:t xml:space="preserve">Recovery time (s)</w:t>
+              <w:t xml:space="preserve">Prosek (ms)</w:t>
+            </w:r>
+          </w:p>
+        </w:tc>
+        <w:tc>
+          <w:tcPr/>
+          <w:p>
+            <w:pPr>
+              <w:pStyle w:val="Compact"/>
+            </w:pPr>
+            <w:r>
+              <w:t xml:space="preserve">Min (ms)</w:t>
+            </w:r>
+          </w:p>
+        </w:tc>
+        <w:tc>
+          <w:tcPr/>
+          <w:p>
+            <w:pPr>
+              <w:pStyle w:val="Compact"/>
+            </w:pPr>
+            <w:r>
+              <w:t xml:space="preserve">Max (ms)</w:t>
             </w:r>
           </w:p>
         </w:tc>
@@ -3017,40 +3572,44 @@
               <w:pStyle w:val="Compact"/>
             </w:pPr>
             <w:r>
-              <w:t xml:space="preserve">MQTT (QoS 1)</w:t>
-            </w:r>
-          </w:p>
-        </w:tc>
-        <w:tc>
-          <w:tcPr/>
-          <w:p>
-            <w:pPr>
-              <w:pStyle w:val="Compact"/>
-            </w:pPr>
-            <w:r>
-              <w:t xml:space="preserve">5 000</w:t>
-            </w:r>
-          </w:p>
-        </w:tc>
-        <w:tc>
-          <w:tcPr/>
-          <w:p>
-            <w:pPr>
-              <w:pStyle w:val="Compact"/>
-            </w:pPr>
-            <w:r>
-              <w:t xml:space="preserve">(n/p)</w:t>
-            </w:r>
-          </w:p>
-        </w:tc>
-        <w:tc>
-          <w:tcPr/>
-          <w:p>
-            <w:pPr>
-              <w:pStyle w:val="Compact"/>
-            </w:pPr>
-            <w:r>
-              <w:t xml:space="preserve">(n/p)</w:t>
+              <w:t xml:space="preserve">Kafka</w:t>
+            </w:r>
+          </w:p>
+        </w:tc>
+        <w:tc>
+          <w:tcPr/>
+          <w:p>
+            <w:pPr>
+              <w:pStyle w:val="Compact"/>
+            </w:pPr>
+            <w:r>
+              <w:rPr>
+                <w:b/>
+                <w:bCs/>
+              </w:rPr>
+              <w:t xml:space="preserve">6 519</w:t>
+            </w:r>
+          </w:p>
+        </w:tc>
+        <w:tc>
+          <w:tcPr/>
+          <w:p>
+            <w:pPr>
+              <w:pStyle w:val="Compact"/>
+            </w:pPr>
+            <w:r>
+              <w:t xml:space="preserve">2 157</w:t>
+            </w:r>
+          </w:p>
+        </w:tc>
+        <w:tc>
+          <w:tcPr/>
+          <w:p>
+            <w:pPr>
+              <w:pStyle w:val="Compact"/>
+            </w:pPr>
+            <w:r>
+              <w:t xml:space="preserve">8 220</w:t>
             </w:r>
           </w:p>
         </w:tc>
@@ -3063,40 +3622,44 @@
               <w:pStyle w:val="Compact"/>
             </w:pPr>
             <w:r>
-              <w:t xml:space="preserve">Kafka (acks=1)</w:t>
-            </w:r>
-          </w:p>
-        </w:tc>
-        <w:tc>
-          <w:tcPr/>
-          <w:p>
-            <w:pPr>
-              <w:pStyle w:val="Compact"/>
-            </w:pPr>
-            <w:r>
-              <w:t xml:space="preserve">5 000</w:t>
-            </w:r>
-          </w:p>
-        </w:tc>
-        <w:tc>
-          <w:tcPr/>
-          <w:p>
-            <w:pPr>
-              <w:pStyle w:val="Compact"/>
-            </w:pPr>
-            <w:r>
-              <w:t xml:space="preserve">(n/p)</w:t>
-            </w:r>
-          </w:p>
-        </w:tc>
-        <w:tc>
-          <w:tcPr/>
-          <w:p>
-            <w:pPr>
-              <w:pStyle w:val="Compact"/>
-            </w:pPr>
-            <w:r>
-              <w:t xml:space="preserve">(n/p)</w:t>
+              <w:t xml:space="preserve">MQTT</w:t>
+            </w:r>
+          </w:p>
+        </w:tc>
+        <w:tc>
+          <w:tcPr/>
+          <w:p>
+            <w:pPr>
+              <w:pStyle w:val="Compact"/>
+            </w:pPr>
+            <w:r>
+              <w:rPr>
+                <w:b/>
+                <w:bCs/>
+              </w:rPr>
+              <w:t xml:space="preserve">6 737</w:t>
+            </w:r>
+          </w:p>
+        </w:tc>
+        <w:tc>
+          <w:tcPr/>
+          <w:p>
+            <w:pPr>
+              <w:pStyle w:val="Compact"/>
+            </w:pPr>
+            <w:r>
+              <w:t xml:space="preserve">3 450</w:t>
+            </w:r>
+          </w:p>
+        </w:tc>
+        <w:tc>
+          <w:tcPr/>
+          <w:p>
+            <w:pPr>
+              <w:pStyle w:val="Compact"/>
+            </w:pPr>
+            <w:r>
+              <w:t xml:space="preserve">8 223</w:t>
             </w:r>
           </w:p>
         </w:tc>
@@ -3104,190 +3667,26 @@
     </w:tbl>
     <w:p>
       <w:pPr>
-        <w:pStyle w:val="BlockText"/>
-      </w:pPr>
-      <w:r>
-        <w:t xml:space="preserve">Vidi napomenu uz 5.3 — skripta priložena, nije pokrenuta u ovom prolazu. Kod Kafke se backlog vidi kao porast consumer lag-a koji se zatim prazni (recovery time = vreme da lag padne na 0); kod MQTT-a se meri vreme da skladište „sustigne" burst.</w:t>
-      </w:r>
-    </w:p>
-    <w:bookmarkEnd w:id="20"/>
-    <w:bookmarkStart w:id="21" w:name="Xa9c179bf6eeb20f2619452f948275797e9bf7cf"/>
-    <w:p>
-      <w:pPr>
-        <w:pStyle w:val="Heading3"/>
-      </w:pPr>
-      <w:r>
-        <w:t xml:space="preserve">5.5 Scenario D — end-to-end alert latencija</w:t>
-      </w:r>
-    </w:p>
-    <w:p>
-      <w:pPr>
-        <w:pStyle w:val="FirstParagraph"/>
-      </w:pPr>
-      <w:r>
-        <w:t xml:space="preserve">Izmereno (3 ponavljanja po brokeru, kritične vrednosti &gt; 50 °C, prozor 10 s):</w:t>
-      </w:r>
-    </w:p>
-    <w:tbl>
-      <w:tblPr>
-        <w:tblStyle w:val="Table"/>
-        <w:tblW w:type="auto" w:w="0"/>
-        <w:tblLook w:firstRow="1" w:lastRow="0" w:firstColumn="0" w:lastColumn="0" w:noHBand="0" w:noVBand="0" w:val="0020"/>
-      </w:tblPr>
-      <w:tblGrid>
-        <w:gridCol w:w="1980"/>
-        <w:gridCol w:w="1980"/>
-        <w:gridCol w:w="1980"/>
-        <w:gridCol w:w="1980"/>
-      </w:tblGrid>
-      <w:tr>
-        <w:trPr>
-          <w:tblHeader w:val="on"/>
-        </w:trPr>
-        <w:tc>
-          <w:tcPr/>
-          <w:p>
-            <w:pPr>
-              <w:pStyle w:val="Compact"/>
-            </w:pPr>
-            <w:r>
-              <w:t xml:space="preserve">Broker</w:t>
-            </w:r>
-          </w:p>
-        </w:tc>
-        <w:tc>
-          <w:tcPr/>
-          <w:p>
-            <w:pPr>
-              <w:pStyle w:val="Compact"/>
-            </w:pPr>
-            <w:r>
-              <w:t xml:space="preserve">Prosek (ms)</w:t>
-            </w:r>
-          </w:p>
-        </w:tc>
-        <w:tc>
-          <w:tcPr/>
-          <w:p>
-            <w:pPr>
-              <w:pStyle w:val="Compact"/>
-            </w:pPr>
-            <w:r>
-              <w:t xml:space="preserve">Min (ms)</w:t>
-            </w:r>
-          </w:p>
-        </w:tc>
-        <w:tc>
-          <w:tcPr/>
-          <w:p>
-            <w:pPr>
-              <w:pStyle w:val="Compact"/>
-            </w:pPr>
-            <w:r>
-              <w:t xml:space="preserve">Max (ms)</w:t>
-            </w:r>
-          </w:p>
-        </w:tc>
-      </w:tr>
-      <w:tr>
-        <w:tc>
-          <w:tcPr/>
-          <w:p>
-            <w:pPr>
-              <w:pStyle w:val="Compact"/>
-            </w:pPr>
-            <w:r>
-              <w:t xml:space="preserve">MQTT</w:t>
-            </w:r>
-          </w:p>
-        </w:tc>
-        <w:tc>
-          <w:tcPr/>
-          <w:p>
-            <w:pPr>
-              <w:pStyle w:val="Compact"/>
-            </w:pPr>
-            <w:r>
-              <w:t xml:space="preserve">8 847</w:t>
-            </w:r>
-          </w:p>
-        </w:tc>
-        <w:tc>
-          <w:tcPr/>
-          <w:p>
-            <w:pPr>
-              <w:pStyle w:val="Compact"/>
-            </w:pPr>
-            <w:r>
-              <w:t xml:space="preserve">8 282</w:t>
-            </w:r>
-          </w:p>
-        </w:tc>
-        <w:tc>
-          <w:tcPr/>
-          <w:p>
-            <w:pPr>
-              <w:pStyle w:val="Compact"/>
-            </w:pPr>
-            <w:r>
-              <w:t xml:space="preserve">9 357</w:t>
-            </w:r>
-          </w:p>
-        </w:tc>
-      </w:tr>
-      <w:tr>
-        <w:tc>
-          <w:tcPr/>
-          <w:p>
-            <w:pPr>
-              <w:pStyle w:val="Compact"/>
-            </w:pPr>
-            <w:r>
-              <w:t xml:space="preserve">Kafka</w:t>
-            </w:r>
-          </w:p>
-        </w:tc>
-        <w:tc>
-          <w:tcPr/>
-          <w:p>
-            <w:pPr>
-              <w:pStyle w:val="Compact"/>
-            </w:pPr>
-            <w:r>
-              <w:t xml:space="preserve">7 626</w:t>
-            </w:r>
-          </w:p>
-        </w:tc>
-        <w:tc>
-          <w:tcPr/>
-          <w:p>
-            <w:pPr>
-              <w:pStyle w:val="Compact"/>
-            </w:pPr>
-            <w:r>
-              <w:t xml:space="preserve">6 936</w:t>
-            </w:r>
-          </w:p>
-        </w:tc>
-        <w:tc>
-          <w:tcPr/>
-          <w:p>
-            <w:pPr>
-              <w:pStyle w:val="Compact"/>
-            </w:pPr>
-            <w:r>
-              <w:t xml:space="preserve">8 016</w:t>
-            </w:r>
-          </w:p>
-        </w:tc>
-      </w:tr>
-    </w:tbl>
-    <w:p>
-      <w:pPr>
         <w:pStyle w:val="BodyText"/>
       </w:pPr>
       <w:r>
-        <w:t xml:space="preserve">Kašnjenje je kod oba brokera dominantno određeno 10-sekundnim tumbling prozorom (poruka mora da sačeka granicu prozora), a ne transportom: sirova latencija isporuke kod Kafke je p95 ~40 ms. Drugim rečima, za alarme u realnom vremenu prozor agregacije, a ne broker, određuje kašnjenje — oba su uporedivo brza na nivou transporta.</w:t>
+        <w:t xml:space="preserve">Kašnjenje je kod oba brokera dominantno određeno 10-sekundnim tumbling prozorom (poruka mora da sačeka granicu prozora), a ne transportom: sirova latencija isporuke kod Kafke je p95 ~40 ms. Rezultati pokazuju da su oba brokera</w:t>
+      </w:r>
+      <w:r>
+        <w:t xml:space="preserve"> </w:t>
+      </w:r>
+      <w:r>
+        <w:rPr>
+          <w:b/>
+          <w:bCs/>
+        </w:rPr>
+        <w:t xml:space="preserve">praktično jednako brza</w:t>
+      </w:r>
+      <w:r>
+        <w:t xml:space="preserve"> </w:t>
+      </w:r>
+      <w:r>
+        <w:t xml:space="preserve">za alerting (~6,5 s prosek) — razlika je unutar varijanse. Prvi trial ima manju latenciju jer poruka „uhvati” prozor bliže kraju.</w:t>
       </w:r>
     </w:p>
     <w:p>
@@ -3299,7 +3698,7 @@
     </w:p>
     <w:bookmarkEnd w:id="21"/>
     <w:bookmarkEnd w:id="22"/>
-    <w:bookmarkStart w:id="26" w:name="Xe80f6eb2bd3d85b3aaef0a98d1749d78859222d"/>
+    <w:bookmarkStart w:id="26" w:name="X6dc14566d6f9836313e3cb35008b5d0ef6b91fc"/>
     <w:p>
       <w:pPr>
         <w:pStyle w:val="Heading2"/>
@@ -3308,7 +3707,7 @@
         <w:t xml:space="preserve">6. Analiza pouzdanosti i odgovori na inženjerska pitanja</w:t>
       </w:r>
     </w:p>
-    <w:bookmarkStart w:id="23" w:name="X77ffe2a4a814d81ef8e43d4af54371db383bef5"/>
+    <w:bookmarkStart w:id="23" w:name="X5255d9cfc214e6444fa596857c7c8e52fffb95a"/>
     <w:p>
       <w:pPr>
         <w:pStyle w:val="Heading3"/>
@@ -3349,6 +3748,298 @@
           <w:bCs/>
         </w:rPr>
         <w:t xml:space="preserve">Prednosti na edge-u:</w:t>
+      </w:r>
+    </w:p>
+    <w:p>
+      <w:pPr>
+        <w:pStyle w:val="Compact"/>
+        <w:numPr>
+          <w:ilvl w:val="0"/>
+          <w:numId w:val="1004"/>
+        </w:numPr>
+      </w:pPr>
+      <w:r>
+        <w:rPr>
+          <w:b/>
+          <w:bCs/>
+        </w:rPr>
+        <w:t xml:space="preserve">Mali otisak.</w:t>
+      </w:r>
+      <w:r>
+        <w:t xml:space="preserve"> </w:t>
+      </w:r>
+      <w:r>
+        <w:t xml:space="preserve">Protokol je izuzetno lagan: minimalno zaglavlje (fiksno 2 bajta), jednostavan klijent koji staje u par desetina KB i radi na mikrokontrolerima sa malo RAM-a i baterijskim napajanjem.</w:t>
+      </w:r>
+    </w:p>
+    <w:p>
+      <w:pPr>
+        <w:pStyle w:val="Compact"/>
+        <w:numPr>
+          <w:ilvl w:val="0"/>
+          <w:numId w:val="1004"/>
+        </w:numPr>
+      </w:pPr>
+      <w:r>
+        <w:rPr>
+          <w:b/>
+          <w:bCs/>
+        </w:rPr>
+        <w:t xml:space="preserve">Tolerancija na lošu mrežu.</w:t>
+      </w:r>
+      <w:r>
+        <w:t xml:space="preserve"> </w:t>
+      </w:r>
+      <w:r>
+        <w:t xml:space="preserve">Radi preko TCP-a uz mehanizme za prekide (keep-alive, Last Will &amp; Testament, perzistentne sesije, QoS 1/2 retransmisije), što odgovara mobilnim/bežičnim vezama na terenu.</w:t>
+      </w:r>
+    </w:p>
+    <w:p>
+      <w:pPr>
+        <w:pStyle w:val="Compact"/>
+        <w:numPr>
+          <w:ilvl w:val="0"/>
+          <w:numId w:val="1004"/>
+        </w:numPr>
+      </w:pPr>
+      <w:r>
+        <w:rPr>
+          <w:b/>
+          <w:bCs/>
+        </w:rPr>
+        <w:t xml:space="preserve">Fleksibilan QoS po poruci.</w:t>
+      </w:r>
+      <w:r>
+        <w:t xml:space="preserve"> </w:t>
+      </w:r>
+      <w:r>
+        <w:t xml:space="preserve">Uređaj bira kompromis kašnjenje↔pouzdanost za svaku poruku (npr. QoS 0 za česta, nekritična očitavanja; QoS 2 za alarme).</w:t>
+      </w:r>
+    </w:p>
+    <w:p>
+      <w:pPr>
+        <w:pStyle w:val="Compact"/>
+        <w:numPr>
+          <w:ilvl w:val="0"/>
+          <w:numId w:val="1004"/>
+        </w:numPr>
+      </w:pPr>
+      <w:r>
+        <w:rPr>
+          <w:b/>
+          <w:bCs/>
+        </w:rPr>
+        <w:t xml:space="preserve">Push model sa malim kašnjenjem.</w:t>
+      </w:r>
+      <w:r>
+        <w:t xml:space="preserve"> </w:t>
+      </w:r>
+      <w:r>
+        <w:t xml:space="preserve">Broker odmah prosleđuje poruke pretplatnicima — pogodno za telemetriju u realnom vremenu i komande.</w:t>
+      </w:r>
+    </w:p>
+    <w:p>
+      <w:pPr>
+        <w:pStyle w:val="FirstParagraph"/>
+      </w:pPr>
+      <w:r>
+        <w:rPr>
+          <w:b/>
+          <w:bCs/>
+        </w:rPr>
+        <w:t xml:space="preserve">Zašto postaje neadekvatan za istorijsku analitiku velikih podataka:</w:t>
+      </w:r>
+    </w:p>
+    <w:p>
+      <w:pPr>
+        <w:pStyle w:val="Compact"/>
+        <w:numPr>
+          <w:ilvl w:val="0"/>
+          <w:numId w:val="1005"/>
+        </w:numPr>
+      </w:pPr>
+      <w:r>
+        <w:rPr>
+          <w:b/>
+          <w:bCs/>
+        </w:rPr>
+        <w:t xml:space="preserve">Broker ne čuva istoriju.</w:t>
+      </w:r>
+      <w:r>
+        <w:t xml:space="preserve"> </w:t>
+      </w:r>
+      <w:r>
+        <w:t xml:space="preserve">Klasičan MQTT broker je</w:t>
+      </w:r>
+      <w:r>
+        <w:t xml:space="preserve"> </w:t>
+      </w:r>
+      <w:r>
+        <w:rPr>
+          <w:i/>
+          <w:iCs/>
+        </w:rPr>
+        <w:t xml:space="preserve">router</w:t>
+      </w:r>
+      <w:r>
+        <w:t xml:space="preserve"> </w:t>
+      </w:r>
+      <w:r>
+        <w:t xml:space="preserve">poruka, a ne skladište. Poruka koja nije isporučena (osim ograničenog retained/persistent slučaja) nestaje — nema</w:t>
+      </w:r>
+      <w:r>
+        <w:t xml:space="preserve"> </w:t>
+      </w:r>
+      <w:r>
+        <w:rPr>
+          <w:i/>
+          <w:iCs/>
+        </w:rPr>
+        <w:t xml:space="preserve">replay</w:t>
+      </w:r>
+      <w:r>
+        <w:t xml:space="preserve">-a istorijskog toka za naknadnu obradu.</w:t>
+      </w:r>
+    </w:p>
+    <w:p>
+      <w:pPr>
+        <w:pStyle w:val="Compact"/>
+        <w:numPr>
+          <w:ilvl w:val="0"/>
+          <w:numId w:val="1005"/>
+        </w:numPr>
+      </w:pPr>
+      <w:r>
+        <w:rPr>
+          <w:b/>
+          <w:bCs/>
+        </w:rPr>
+        <w:t xml:space="preserve">Nema particionисања ni consumer grupa.</w:t>
+      </w:r>
+      <w:r>
+        <w:t xml:space="preserve"> </w:t>
+      </w:r>
+      <w:r>
+        <w:t xml:space="preserve">Ne postoji ugrađen model za horizontalno deljenje toka među više potrošača radi paralelne obrade ogromnih količina podataka; skaliranje analitike je teško.</w:t>
+      </w:r>
+    </w:p>
+    <w:p>
+      <w:pPr>
+        <w:pStyle w:val="Compact"/>
+        <w:numPr>
+          <w:ilvl w:val="0"/>
+          <w:numId w:val="1005"/>
+        </w:numPr>
+      </w:pPr>
+      <w:r>
+        <w:rPr>
+          <w:b/>
+          <w:bCs/>
+        </w:rPr>
+        <w:t xml:space="preserve">Slaba kontrola redosleda i ponovne obrade.</w:t>
+      </w:r>
+      <w:r>
+        <w:t xml:space="preserve"> </w:t>
+      </w:r>
+      <w:r>
+        <w:t xml:space="preserve">Bez trajnog, uređenog loga sa offsetima, nije moguće „premotati” tok i ponovo izračunati agregate nad istorijom — ključno za batch/stream analitiku velikih podataka.</w:t>
+      </w:r>
+    </w:p>
+    <w:p>
+      <w:pPr>
+        <w:pStyle w:val="Compact"/>
+        <w:numPr>
+          <w:ilvl w:val="0"/>
+          <w:numId w:val="1005"/>
+        </w:numPr>
+      </w:pPr>
+      <w:r>
+        <w:rPr>
+          <w:b/>
+          <w:bCs/>
+        </w:rPr>
+        <w:t xml:space="preserve">Bez ugrađene trajnosti i garancija end-to-end.</w:t>
+      </w:r>
+      <w:r>
+        <w:t xml:space="preserve"> </w:t>
+      </w:r>
+      <w:r>
+        <w:t xml:space="preserve">Pouzdano dugotrajno čuvanje zahteva poseban sloj (baza/Kafka) — MQTT sam po sebi nije</w:t>
+      </w:r>
+      <w:r>
+        <w:t xml:space="preserve"> </w:t>
+      </w:r>
+      <w:r>
+        <w:rPr>
+          <w:i/>
+          <w:iCs/>
+        </w:rPr>
+        <w:t xml:space="preserve">system of record</w:t>
+      </w:r>
+      <w:r>
+        <w:t xml:space="preserve">.</w:t>
+      </w:r>
+    </w:p>
+    <w:p>
+      <w:pPr>
+        <w:pStyle w:val="FirstParagraph"/>
+      </w:pPr>
+      <w:r>
+        <w:t xml:space="preserve">Ukratko: MQTT je odličan</w:t>
+      </w:r>
+      <w:r>
+        <w:t xml:space="preserve"> </w:t>
+      </w:r>
+      <w:r>
+        <w:rPr>
+          <w:b/>
+          <w:bCs/>
+        </w:rPr>
+        <w:t xml:space="preserve">transport</w:t>
+      </w:r>
+      <w:r>
+        <w:t xml:space="preserve"> </w:t>
+      </w:r>
+      <w:r>
+        <w:t xml:space="preserve">od senzora do ivice/clouda, ali nije platforma za skladištenje i ponovljivu obradu velikih istorijskih tokova.</w:t>
+      </w:r>
+    </w:p>
+    <w:bookmarkEnd w:id="23"/>
+    <w:bookmarkStart w:id="24" w:name="X56fb4cb76e0285dd2d07ba6ac2c42077476bafa"/>
+    <w:p>
+      <w:pPr>
+        <w:pStyle w:val="Heading3"/>
+      </w:pPr>
+      <w:r>
+        <w:t xml:space="preserve">Pitanje 2 — Zašto Kafka dominira u</w:t>
+      </w:r>
+      <w:r>
+        <w:t xml:space="preserve"> </w:t>
+      </w:r>
+      <w:r>
+        <w:rPr>
+          <w:i/>
+          <w:iCs/>
+        </w:rPr>
+        <w:t xml:space="preserve">data-intensive</w:t>
+      </w:r>
+      <w:r>
+        <w:t xml:space="preserve"> </w:t>
+      </w:r>
+      <w:r>
+        <w:t xml:space="preserve">cloud sistemima, kolika je „cena” skalabilnosti i da li je realna na ograničenom edge hardveru?</w:t>
+      </w:r>
+    </w:p>
+    <w:p>
+      <w:pPr>
+        <w:pStyle w:val="FirstParagraph"/>
+      </w:pPr>
+      <w:r>
+        <w:rPr>
+          <w:b/>
+          <w:bCs/>
+        </w:rPr>
+        <w:t xml:space="preserve">Zašto dominira u cloud-u:</w:t>
       </w:r>
     </w:p>
     <w:p>
@@ -3364,13 +4055,42 @@
           <w:b/>
           <w:bCs/>
         </w:rPr>
-        <w:t xml:space="preserve">Mali otisak.</w:t>
-      </w:r>
-      <w:r>
-        <w:t xml:space="preserve"> </w:t>
-      </w:r>
-      <w:r>
-        <w:t xml:space="preserve">Protokol je izuzetno lagan: minimalno zaglavlje (fiksno 2 bajta), jednostavan klijent koji staje u par desetina KB i radi na mikrokontrolerima sa malo RAM-a i baterijskim napajanjem.</w:t>
+        <w:t xml:space="preserve">Trajni, uređeni, particionисani log.</w:t>
+      </w:r>
+      <w:r>
+        <w:t xml:space="preserve"> </w:t>
+      </w:r>
+      <w:r>
+        <w:t xml:space="preserve">Kafka čuva poruke na disku zadati period (retention) bez obzira na potrošnju. Potrošači mogu da čitaju, ponovo čitaju i „premotavaju” tok pomoću</w:t>
+      </w:r>
+      <w:r>
+        <w:t xml:space="preserve"> </w:t>
+      </w:r>
+      <w:r>
+        <w:rPr>
+          <w:b/>
+          <w:bCs/>
+        </w:rPr>
+        <w:t xml:space="preserve">offset</w:t>
+      </w:r>
+      <w:r>
+        <w:t xml:space="preserve">-a — temelj za istorijsku analitiku,</w:t>
+      </w:r>
+      <w:r>
+        <w:t xml:space="preserve"> </w:t>
+      </w:r>
+      <w:r>
+        <w:rPr>
+          <w:i/>
+          <w:iCs/>
+        </w:rPr>
+        <w:t xml:space="preserve">event sourcing</w:t>
+      </w:r>
+      <w:r>
+        <w:t xml:space="preserve"> </w:t>
+      </w:r>
+      <w:r>
+        <w:t xml:space="preserve">i ponovnu obradu.</w:t>
       </w:r>
     </w:p>
     <w:p>
@@ -3386,13 +4106,29 @@
           <w:b/>
           <w:bCs/>
         </w:rPr>
-        <w:t xml:space="preserve">Tolerancija na lošu mrežu.</w:t>
-      </w:r>
-      <w:r>
-        <w:t xml:space="preserve"> </w:t>
-      </w:r>
-      <w:r>
-        <w:t xml:space="preserve">Radi preko TCP-a uz mehanizme za prekide (keep-alive, Last Will &amp; Testament, perzistentne sesije, QoS 1/2 retransmisije), što odgovara mobilnim/bežičnim vezama na terenu.</w:t>
+        <w:t xml:space="preserve">Horizontalna skalabilnost preko particija.</w:t>
+      </w:r>
+      <w:r>
+        <w:t xml:space="preserve"> </w:t>
+      </w:r>
+      <w:r>
+        <w:t xml:space="preserve">Topic se deli na particije raspoređene po brokerima;</w:t>
+      </w:r>
+      <w:r>
+        <w:t xml:space="preserve"> </w:t>
+      </w:r>
+      <w:r>
+        <w:rPr>
+          <w:b/>
+          <w:bCs/>
+        </w:rPr>
+        <w:t xml:space="preserve">consumer grupe</w:t>
+      </w:r>
+      <w:r>
+        <w:t xml:space="preserve"> </w:t>
+      </w:r>
+      <w:r>
+        <w:t xml:space="preserve">paralelizuju obradu (jedna particija po potrošaču u grupi). Tako se postiže propusnost reda miliona poruka u sekundi.</w:t>
       </w:r>
     </w:p>
     <w:p>
@@ -3408,13 +4144,35 @@
           <w:b/>
           <w:bCs/>
         </w:rPr>
-        <w:t xml:space="preserve">Fleksibilan QoS po poruci.</w:t>
-      </w:r>
-      <w:r>
-        <w:t xml:space="preserve"> </w:t>
-      </w:r>
-      <w:r>
-        <w:t xml:space="preserve">Uređaj bira kompromis kašnjenje↔pouzdanost za svaku poruku (npr. QoS 0 za česta, nekritična očitavanja; QoS 2 za alarme).</w:t>
+        <w:t xml:space="preserve">Trajnost i replikacija.</w:t>
+      </w:r>
+      <w:r>
+        <w:t xml:space="preserve"> </w:t>
+      </w:r>
+      <w:r>
+        <w:rPr>
+          <w:rStyle w:val="VerbatimChar"/>
+        </w:rPr>
+        <w:t xml:space="preserve">acks=all</w:t>
+      </w:r>
+      <w:r>
+        <w:t xml:space="preserve"> </w:t>
+      </w:r>
+      <w:r>
+        <w:t xml:space="preserve">+ replikacija ISR čine ga</w:t>
+      </w:r>
+      <w:r>
+        <w:t xml:space="preserve"> </w:t>
+      </w:r>
+      <w:r>
+        <w:rPr>
+          <w:i/>
+          <w:iCs/>
+        </w:rPr>
+        <w:t xml:space="preserve">system of record</w:t>
+      </w:r>
+      <w:r>
+        <w:t xml:space="preserve">-om otpornim na otkaze brokera.</w:t>
       </w:r>
     </w:p>
     <w:p>
@@ -3430,13 +4188,13 @@
           <w:b/>
           <w:bCs/>
         </w:rPr>
-        <w:t xml:space="preserve">Push model sa malim kašnjenjem.</w:t>
-      </w:r>
-      <w:r>
-        <w:t xml:space="preserve"> </w:t>
-      </w:r>
-      <w:r>
-        <w:t xml:space="preserve">Broker odmah prosleđuje poruke pretplatnicima — pogodno za telemetriju u realnom vremenu i komande.</w:t>
+        <w:t xml:space="preserve">Decoupling i fan-out.</w:t>
+      </w:r>
+      <w:r>
+        <w:t xml:space="preserve"> </w:t>
+      </w:r>
+      <w:r>
+        <w:t xml:space="preserve">Više nezavisnih consumer grupa (npr. storage i analytics) čita isti tok bez međusobnog uticaja — idealno za mikroservise.</w:t>
       </w:r>
     </w:p>
     <w:p>
@@ -3448,7 +4206,7 @@
           <w:b/>
           <w:bCs/>
         </w:rPr>
-        <w:t xml:space="preserve">Zašto postaje neadekvatan za istorijsku analitiku velikih podataka:</w:t>
+        <w:t xml:space="preserve">Cena skalabilnosti (resursi):</w:t>
       </w:r>
     </w:p>
     <w:p>
@@ -3464,42 +4222,13 @@
           <w:b/>
           <w:bCs/>
         </w:rPr>
-        <w:t xml:space="preserve">Broker ne čuva istoriju.</w:t>
-      </w:r>
-      <w:r>
-        <w:t xml:space="preserve"> </w:t>
-      </w:r>
-      <w:r>
-        <w:t xml:space="preserve">Klasičan MQTT broker je</w:t>
-      </w:r>
-      <w:r>
-        <w:t xml:space="preserve"> </w:t>
-      </w:r>
-      <w:r>
-        <w:rPr>
-          <w:i/>
-          <w:iCs/>
-        </w:rPr>
-        <w:t xml:space="preserve">router</w:t>
-      </w:r>
-      <w:r>
-        <w:t xml:space="preserve"> </w:t>
-      </w:r>
-      <w:r>
-        <w:t xml:space="preserve">poruka, a ne skladište. Poruka koja nije isporučena (osim ograničenog retained/persistent slučaja) nestaje — nema</w:t>
-      </w:r>
-      <w:r>
-        <w:t xml:space="preserve"> </w:t>
-      </w:r>
-      <w:r>
-        <w:rPr>
-          <w:i/>
-          <w:iCs/>
-        </w:rPr>
-        <w:t xml:space="preserve">replay</w:t>
-      </w:r>
-      <w:r>
-        <w:t xml:space="preserve">-a istorijskog toka za naknadnu obradu.</w:t>
+        <w:t xml:space="preserve">Memorija i CPU.</w:t>
+      </w:r>
+      <w:r>
+        <w:t xml:space="preserve"> </w:t>
+      </w:r>
+      <w:r>
+        <w:t xml:space="preserve">JVM-bazirani brokeri, page-cache za log, kompresija/replikacija i koordinacija (KRaft kontroler) troše znatno više RAM-a i CPU-a nego MQTT broker. Realno se računa sa stotinama MB do GB RAM-a po brokeru.</w:t>
       </w:r>
     </w:p>
     <w:p>
@@ -3515,13 +4244,13 @@
           <w:b/>
           <w:bCs/>
         </w:rPr>
-        <w:t xml:space="preserve">Nema particionисања ni consumer grupa.</w:t>
-      </w:r>
-      <w:r>
-        <w:t xml:space="preserve"> </w:t>
-      </w:r>
-      <w:r>
-        <w:t xml:space="preserve">Ne postoji ugrađen model za horizontalno deljenje toka među više potrošača radi paralelne obrade ogromnih količina podataka; skaliranje analitike je teško.</w:t>
+        <w:t xml:space="preserve">Disk I/O i prostor.</w:t>
+      </w:r>
+      <w:r>
+        <w:t xml:space="preserve"> </w:t>
+      </w:r>
+      <w:r>
+        <w:t xml:space="preserve">Trajni log po definiciji troši disk; visok throughput zahteva brz I/O podsistem.</w:t>
       </w:r>
     </w:p>
     <w:p>
@@ -3537,35 +4266,47 @@
           <w:b/>
           <w:bCs/>
         </w:rPr>
-        <w:t xml:space="preserve">Slaba kontrola redosleda i ponovne obrade.</w:t>
-      </w:r>
-      <w:r>
-        <w:t xml:space="preserve"> </w:t>
-      </w:r>
-      <w:r>
-        <w:t xml:space="preserve">Bez trajnog, uređenog loga sa offsetima, nije moguće „premotati" tok i ponovo izračunati agregate nad istorijom — ključno za batch/stream analitiku velikih podataka.</w:t>
-      </w:r>
-    </w:p>
-    <w:p>
-      <w:pPr>
-        <w:pStyle w:val="Compact"/>
-        <w:numPr>
-          <w:ilvl w:val="0"/>
-          <w:numId w:val="1007"/>
-        </w:numPr>
-      </w:pPr>
-      <w:r>
-        <w:rPr>
-          <w:b/>
-          <w:bCs/>
-        </w:rPr>
-        <w:t xml:space="preserve">Bez ugrađene trajnosti i garancija end-to-end.</w:t>
-      </w:r>
-      <w:r>
-        <w:t xml:space="preserve"> </w:t>
-      </w:r>
-      <w:r>
-        <w:t xml:space="preserve">Pouzdano dugotrajno čuvanje zahteva poseban sloj (baza/Kafka) — MQTT sam po sebi nije</w:t>
+        <w:t xml:space="preserve">Operativna složenost.</w:t>
+      </w:r>
+      <w:r>
+        <w:t xml:space="preserve"> </w:t>
+      </w:r>
+      <w:r>
+        <w:t xml:space="preserve">Particionисање, replikacija, retencija, monitoring lag-a — više konfiguracije i održavanja nego kod MQTT-a.</w:t>
+      </w:r>
+    </w:p>
+    <w:p>
+      <w:pPr>
+        <w:pStyle w:val="FirstParagraph"/>
+      </w:pPr>
+      <w:r>
+        <w:rPr>
+          <w:b/>
+          <w:bCs/>
+        </w:rPr>
+        <w:t xml:space="preserve">Da li je realno na ograničenom edge hardveru?</w:t>
+      </w:r>
+      <w:r>
+        <w:t xml:space="preserve"> </w:t>
+      </w:r>
+      <w:r>
+        <w:t xml:space="preserve">Uglavnom</w:t>
+      </w:r>
+      <w:r>
+        <w:t xml:space="preserve"> </w:t>
+      </w:r>
+      <w:r>
+        <w:rPr>
+          <w:b/>
+          <w:bCs/>
+        </w:rPr>
+        <w:t xml:space="preserve">ne</w:t>
+      </w:r>
+      <w:r>
+        <w:t xml:space="preserve"> </w:t>
+      </w:r>
+      <w:r>
+        <w:t xml:space="preserve">kao puni broker. Iako KRaft režim uklanja ZooKeeper i smanjuje otisak, Kafka i dalje očekuje JVM, disk i RAM koje tipičan senzor/mikrokontroler nema. Na jačim edge</w:t>
       </w:r>
       <w:r>
         <w:t xml:space="preserve"> </w:t>
@@ -3575,44 +4316,10 @@
           <w:i/>
           <w:iCs/>
         </w:rPr>
-        <w:t xml:space="preserve">system of record</w:t>
-      </w:r>
-      <w:r>
-        <w:t xml:space="preserve">.</w:t>
-      </w:r>
-    </w:p>
-    <w:p>
-      <w:pPr>
-        <w:pStyle w:val="FirstParagraph"/>
-      </w:pPr>
-      <w:r>
-        <w:t xml:space="preserve">Ukratko: MQTT je odličan</w:t>
-      </w:r>
-      <w:r>
-        <w:t xml:space="preserve"> </w:t>
-      </w:r>
-      <w:r>
-        <w:rPr>
-          <w:b/>
-          <w:bCs/>
-        </w:rPr>
-        <w:t xml:space="preserve">transport</w:t>
-      </w:r>
-      <w:r>
-        <w:t xml:space="preserve"> </w:t>
-      </w:r>
-      <w:r>
-        <w:t xml:space="preserve">od senzora do ivice/clouda, ali nije platforma za skladištenje i ponovljivu obradu velikih istorijskih tokova.</w:t>
-      </w:r>
-    </w:p>
-    <w:bookmarkEnd w:id="23"/>
-    <w:bookmarkStart w:id="24" w:name="Xad805f93b9d5fd0dead52a80306d5673d8bf451"/>
-    <w:p>
-      <w:pPr>
-        <w:pStyle w:val="Heading3"/>
-      </w:pPr>
-      <w:r>
-        <w:t xml:space="preserve">Pitanje 2 — Zašto Kafka dominira u</w:t>
+        <w:t xml:space="preserve">gateway</w:t>
+      </w:r>
+      <w:r>
+        <w:t xml:space="preserve">-ima (npr. industrijski PC) jeste izvodljiva, ali na pravom</w:t>
       </w:r>
       <w:r>
         <w:t xml:space="preserve"> </w:t>
@@ -3622,13 +4329,39 @@
           <w:i/>
           <w:iCs/>
         </w:rPr>
-        <w:t xml:space="preserve">data-intensive</w:t>
-      </w:r>
-      <w:r>
-        <w:t xml:space="preserve"> </w:t>
-      </w:r>
-      <w:r>
-        <w:t xml:space="preserve">cloud sistemima, kolika je „cena" skalabilnosti i da li je realna na ograničenom edge hardveru?</w:t>
+        <w:t xml:space="preserve">constrained</w:t>
+      </w:r>
+      <w:r>
+        <w:t xml:space="preserve"> </w:t>
+      </w:r>
+      <w:r>
+        <w:t xml:space="preserve">hardveru se umesto toga koristi MQTT do ivice, a Kafka u cloud-u/regionalnom čvorištu (često uz MQTT→Kafka most). To je upravo arhitektonski</w:t>
+      </w:r>
+      <w:r>
+        <w:t xml:space="preserve"> </w:t>
+      </w:r>
+      <w:r>
+        <w:rPr>
+          <w:i/>
+          <w:iCs/>
+        </w:rPr>
+        <w:t xml:space="preserve">trade-off</w:t>
+      </w:r>
+      <w:r>
+        <w:t xml:space="preserve"> </w:t>
+      </w:r>
+      <w:r>
+        <w:t xml:space="preserve">koji ovaj projekat ilustruje.</w:t>
+      </w:r>
+    </w:p>
+    <w:bookmarkEnd w:id="24"/>
+    <w:bookmarkStart w:id="25" w:name="pitanje-3-uporedna-tabela-performansi"/>
+    <w:p>
+      <w:pPr>
+        <w:pStyle w:val="Heading3"/>
+      </w:pPr>
+      <w:r>
+        <w:t xml:space="preserve">Pitanje 3 — Uporedna tabela performansi</w:t>
       </w:r>
     </w:p>
     <w:p>
@@ -3636,11 +4369,162 @@
         <w:pStyle w:val="FirstParagraph"/>
       </w:pPr>
       <w:r>
-        <w:rPr>
-          <w:b/>
-          <w:bCs/>
-        </w:rPr>
-        <w:t xml:space="preserve">Zašto dominira u cloud-u:</w:t>
+        <w:t xml:space="preserve">Vidi</w:t>
+      </w:r>
+      <w:r>
+        <w:t xml:space="preserve"> </w:t>
+      </w:r>
+      <w:r>
+        <w:rPr>
+          <w:b/>
+          <w:bCs/>
+        </w:rPr>
+        <w:t xml:space="preserve">Poglavlje 5.1</w:t>
+      </w:r>
+      <w:r>
+        <w:t xml:space="preserve"> </w:t>
+      </w:r>
+      <w:r>
+        <w:t xml:space="preserve">(popunjeno izmerenim vrednostima). Ključni nalazi: Kafka postiže višestruko veći throughput i bolje skalira (do ~50 900 msg/s pri 1000 uređaja vs ~2 350 msg/s kod MQTT-a), ali po ceni resursa — broker troši</w:t>
+      </w:r>
+      <w:r>
+        <w:t xml:space="preserve"> </w:t>
+      </w:r>
+      <w:r>
+        <w:rPr>
+          <w:b/>
+          <w:bCs/>
+        </w:rPr>
+        <w:t xml:space="preserve">~400–530 MB RAM</w:t>
+      </w:r>
+      <w:r>
+        <w:t xml:space="preserve"> </w:t>
+      </w:r>
+      <w:r>
+        <w:t xml:space="preserve">i preko 100 % CPU pod opterećenjem, naspram</w:t>
+      </w:r>
+      <w:r>
+        <w:t xml:space="preserve"> </w:t>
+      </w:r>
+      <w:r>
+        <w:rPr>
+          <w:b/>
+          <w:bCs/>
+        </w:rPr>
+        <w:t xml:space="preserve">~2,7 MB RAM</w:t>
+      </w:r>
+      <w:r>
+        <w:t xml:space="preserve"> </w:t>
+      </w:r>
+      <w:r>
+        <w:t xml:space="preserve">i ~0,06 % CPU kod Mosquitta (≈150× razlika u memoriji). Latencija isporuke kod Kafke raste sa jačinom potvrde (acks=0/1/all → p95 56/148/191 ms).</w:t>
+      </w:r>
+      <w:r>
+        <w:t xml:space="preserve"> </w:t>
+      </w:r>
+      <w:r>
+        <w:rPr>
+          <w:b/>
+          <w:bCs/>
+        </w:rPr>
+        <w:t xml:space="preserve">Scenario B</w:t>
+      </w:r>
+      <w:r>
+        <w:t xml:space="preserve"> </w:t>
+      </w:r>
+      <w:r>
+        <w:t xml:space="preserve">(prekid mreže publishera) pokazuje ključnu arhitektonsku razliku: Kafka producer ima lokalni buffer i retry mehanizam → ~0% gubitka uz duplikate; MQTT publisher nema takav mehanizam → ~88% gubitka (MQTT QoS garantuje isporuku broker→pretplatnik, ne publisher→broker tokom prekida).</w:t>
+      </w:r>
+      <w:r>
+        <w:t xml:space="preserve"> </w:t>
+      </w:r>
+      <w:r>
+        <w:rPr>
+          <w:b/>
+          <w:bCs/>
+        </w:rPr>
+        <w:t xml:space="preserve">Scenario C</w:t>
+      </w:r>
+      <w:r>
+        <w:t xml:space="preserve"> </w:t>
+      </w:r>
+      <w:r>
+        <w:t xml:space="preserve">(burst) pokazuje da oba brokera podnose skok opterećenja bez gubitka, sa MQTT-om koji ima brži recovery (1,2 s vs 3,2 s) zbog manjeg overhead-a. End-to-end alert latencija (Scenario D) je praktično ista (~6,5 s) — dominira agregacioni prozor. Time je kvantifikovan kompromis: MQTT = minimalni resursi i brz za edge, ali ranjiv pri prekidima mreže; Kafka = visok throughput, trajnost i oporavak za cloud uz znatnu resursnu cenu.</w:t>
+      </w:r>
+    </w:p>
+    <w:p>
+      <w:r>
+        <w:pict>
+          <v:rect style="width:0;height:1.5pt" o:hralign="center" o:hrstd="t" o:hr="t"/>
+        </w:pict>
+      </w:r>
+    </w:p>
+    <w:bookmarkEnd w:id="25"/>
+    <w:bookmarkEnd w:id="26"/>
+    <w:bookmarkStart w:id="27" w:name="zaključak"/>
+    <w:p>
+      <w:pPr>
+        <w:pStyle w:val="Heading2"/>
+      </w:pPr>
+      <w:r>
+        <w:t xml:space="preserve">7. Zaključak</w:t>
+      </w:r>
+    </w:p>
+    <w:p>
+      <w:pPr>
+        <w:pStyle w:val="FirstParagraph"/>
+      </w:pPr>
+      <w:r>
+        <w:t xml:space="preserve">MQTT i Kafka rešavaju komplementarne probleme.</w:t>
+      </w:r>
+      <w:r>
+        <w:t xml:space="preserve"> </w:t>
+      </w:r>
+      <w:r>
+        <w:rPr>
+          <w:b/>
+          <w:bCs/>
+        </w:rPr>
+        <w:t xml:space="preserve">MQTT</w:t>
+      </w:r>
+      <w:r>
+        <w:t xml:space="preserve"> </w:t>
+      </w:r>
+      <w:r>
+        <w:t xml:space="preserve">je optimalan kao lagani, push transport sa edge uređaja uz fleksibilan QoS i otpornost na loše mreže, ali nije skladište niti platforma za ponovljivu analitiku.</w:t>
+      </w:r>
+      <w:r>
+        <w:t xml:space="preserve"> </w:t>
+      </w:r>
+      <w:r>
+        <w:rPr>
+          <w:b/>
+          <w:bCs/>
+        </w:rPr>
+        <w:t xml:space="preserve">Kafka</w:t>
+      </w:r>
+      <w:r>
+        <w:t xml:space="preserve"> </w:t>
+      </w:r>
+      <w:r>
+        <w:t xml:space="preserve">je trajni, skalabilni log koji dominira u data-intensive cloud obradama, po ceni znatno veće potrošnje resursa i operativne složenosti — što je čini neprikladnom za rad direktno na hardverski ograničenim senzorima. Tipična produkcija ih kombinuje: MQTT do ivice, Kafka u cloud-u. Merenja iz Poglavlja 5 kvantifikuju ovaj kompromis kroz throughput, latenciju, gubitak poruka i potrošnju resursa.</w:t>
+      </w:r>
+    </w:p>
+    <w:p>
+      <w:r>
+        <w:pict>
+          <v:rect style="width:0;height:1.5pt" o:hralign="center" o:hrstd="t" o:hr="t"/>
+        </w:pict>
+      </w:r>
+    </w:p>
+    <w:bookmarkEnd w:id="27"/>
+    <w:bookmarkStart w:id="28" w:name="Xf04dbc200677ba4df07299f533f5e285689feec"/>
+    <w:p>
+      <w:pPr>
+        <w:pStyle w:val="Heading2"/>
+      </w:pPr>
+      <w:r>
+        <w:t xml:space="preserve">8. Reprodukcija (isporučeni rezultati projekta)</w:t>
       </w:r>
     </w:p>
     <w:p>
@@ -3656,42 +4540,13 @@
           <w:b/>
           <w:bCs/>
         </w:rPr>
-        <w:t xml:space="preserve">Trajni, uređeni, particionисani log.</w:t>
-      </w:r>
-      <w:r>
-        <w:t xml:space="preserve"> </w:t>
-      </w:r>
-      <w:r>
-        <w:t xml:space="preserve">Kafka čuva poruke na disku zadati period (retention) bez obzira na potrošnju. Potrošači mogu da čitaju, ponovo čitaju i „premotavaju" tok pomoću</w:t>
-      </w:r>
-      <w:r>
-        <w:t xml:space="preserve"> </w:t>
-      </w:r>
-      <w:r>
-        <w:rPr>
-          <w:b/>
-          <w:bCs/>
-        </w:rPr>
-        <w:t xml:space="preserve">offset</w:t>
-      </w:r>
-      <w:r>
-        <w:t xml:space="preserve">-a — temelj za istorijsku analitiku,</w:t>
-      </w:r>
-      <w:r>
-        <w:t xml:space="preserve"> </w:t>
-      </w:r>
-      <w:r>
-        <w:rPr>
-          <w:i/>
-          <w:iCs/>
-        </w:rPr>
-        <w:t xml:space="preserve">event sourcing</w:t>
-      </w:r>
-      <w:r>
-        <w:t xml:space="preserve"> </w:t>
-      </w:r>
-      <w:r>
-        <w:t xml:space="preserve">i ponovnu obradu.</w:t>
+        <w:t xml:space="preserve">Git repo</w:t>
+      </w:r>
+      <w:r>
+        <w:t xml:space="preserve"> </w:t>
+      </w:r>
+      <w:r>
+        <w:t xml:space="preserve">— kompletan izvorni kod i konfiguracija.</w:t>
       </w:r>
     </w:p>
     <w:p>
@@ -3707,29 +4562,28 @@
           <w:b/>
           <w:bCs/>
         </w:rPr>
-        <w:t xml:space="preserve">Horizontalna skalabilnost preko particija.</w:t>
-      </w:r>
-      <w:r>
-        <w:t xml:space="preserve"> </w:t>
-      </w:r>
-      <w:r>
-        <w:t xml:space="preserve">Topic se deli na particije raspoređene po brokerima;</w:t>
-      </w:r>
-      <w:r>
-        <w:t xml:space="preserve"> </w:t>
-      </w:r>
-      <w:r>
-        <w:rPr>
-          <w:b/>
-          <w:bCs/>
-        </w:rPr>
-        <w:t xml:space="preserve">consumer grupe</w:t>
-      </w:r>
-      <w:r>
-        <w:t xml:space="preserve"> </w:t>
-      </w:r>
-      <w:r>
-        <w:t xml:space="preserve">paralelizuju obradu (jedna particija po potrošaču u grupi). Tako se postiže propusnost reda miliona poruka u sekundi.</w:t>
+        <w:t xml:space="preserve">Docker Compose</w:t>
+      </w:r>
+      <w:r>
+        <w:t xml:space="preserve"> </w:t>
+      </w:r>
+      <w:r>
+        <w:t xml:space="preserve">—</w:t>
+      </w:r>
+      <w:r>
+        <w:t xml:space="preserve"> </w:t>
+      </w:r>
+      <w:r>
+        <w:rPr>
+          <w:rStyle w:val="VerbatimChar"/>
+        </w:rPr>
+        <w:t xml:space="preserve">docker-compose.yml</w:t>
+      </w:r>
+      <w:r>
+        <w:t xml:space="preserve"> </w:t>
+      </w:r>
+      <w:r>
+        <w:t xml:space="preserve">(PostgreSQL, Mosquitto, Kafka/KRaft, 6 mikroservisa).</w:t>
       </w:r>
     </w:p>
     <w:p>
@@ -3745,7 +4599,13 @@
           <w:b/>
           <w:bCs/>
         </w:rPr>
-        <w:t xml:space="preserve">Trajnost i replikacija.</w:t>
+        <w:t xml:space="preserve">Konfiguracija brokera</w:t>
+      </w:r>
+      <w:r>
+        <w:t xml:space="preserve"> </w:t>
+      </w:r>
+      <w:r>
+        <w:t xml:space="preserve">—</w:t>
       </w:r>
       <w:r>
         <w:t xml:space="preserve"> </w:t>
@@ -3754,26 +4614,34 @@
         <w:rPr>
           <w:rStyle w:val="VerbatimChar"/>
         </w:rPr>
-        <w:t xml:space="preserve">acks=all</w:t>
-      </w:r>
-      <w:r>
-        <w:t xml:space="preserve"> </w:t>
-      </w:r>
-      <w:r>
-        <w:t xml:space="preserve">+ replikacija ISR čine ga</w:t>
-      </w:r>
-      <w:r>
-        <w:t xml:space="preserve"> </w:t>
-      </w:r>
-      <w:r>
-        <w:rPr>
-          <w:i/>
-          <w:iCs/>
-        </w:rPr>
-        <w:t xml:space="preserve">system of record</w:t>
-      </w:r>
-      <w:r>
-        <w:t xml:space="preserve">-om otpornim na otkaze brokera.</w:t>
+        <w:t xml:space="preserve">mqtt/mosquitto.conf</w:t>
+      </w:r>
+      <w:r>
+        <w:t xml:space="preserve">; Kafka KRaft env u compose-u;</w:t>
+      </w:r>
+      <w:r>
+        <w:t xml:space="preserve"> </w:t>
+      </w:r>
+      <w:r>
+        <w:rPr>
+          <w:rStyle w:val="VerbatimChar"/>
+        </w:rPr>
+        <w:t xml:space="preserve">acks</w:t>
+      </w:r>
+      <w:r>
+        <w:t xml:space="preserve">/</w:t>
+      </w:r>
+      <w:r>
+        <w:rPr>
+          <w:rStyle w:val="VerbatimChar"/>
+        </w:rPr>
+        <w:t xml:space="preserve">QoS</w:t>
+      </w:r>
+      <w:r>
+        <w:t xml:space="preserve"> </w:t>
+      </w:r>
+      <w:r>
+        <w:t xml:space="preserve">parametrizovani.</w:t>
       </w:r>
     </w:p>
     <w:p>
@@ -3789,25 +4657,28 @@
           <w:b/>
           <w:bCs/>
         </w:rPr>
-        <w:t xml:space="preserve">Decoupling i fan-out.</w:t>
-      </w:r>
-      <w:r>
-        <w:t xml:space="preserve"> </w:t>
-      </w:r>
-      <w:r>
-        <w:t xml:space="preserve">Više nezavisnih consumer grupa (npr. storage i analytics) čita isti tok bez međusobnog uticaja — idealno za mikroservise.</w:t>
-      </w:r>
-    </w:p>
-    <w:p>
-      <w:pPr>
-        <w:pStyle w:val="FirstParagraph"/>
-      </w:pPr>
-      <w:r>
-        <w:rPr>
-          <w:b/>
-          <w:bCs/>
-        </w:rPr>
-        <w:t xml:space="preserve">Cena skalabilnosti (resursi):</w:t>
+        <w:t xml:space="preserve">Benchmark skripte</w:t>
+      </w:r>
+      <w:r>
+        <w:t xml:space="preserve"> </w:t>
+      </w:r>
+      <w:r>
+        <w:t xml:space="preserve">—</w:t>
+      </w:r>
+      <w:r>
+        <w:t xml:space="preserve"> </w:t>
+      </w:r>
+      <w:r>
+        <w:rPr>
+          <w:rStyle w:val="VerbatimChar"/>
+        </w:rPr>
+        <w:t xml:space="preserve">benchmarks/scripts/</w:t>
+      </w:r>
+      <w:r>
+        <w:t xml:space="preserve"> </w:t>
+      </w:r>
+      <w:r>
+        <w:t xml:space="preserve">(scenariji A–D, oba brokera, nativni alati).</w:t>
       </w:r>
     </w:p>
     <w:p>
@@ -3815,7 +4686,7 @@
         <w:pStyle w:val="Compact"/>
         <w:numPr>
           <w:ilvl w:val="0"/>
-          <w:numId w:val="1009"/>
+          <w:numId w:val="1008"/>
         </w:numPr>
       </w:pPr>
       <w:r>
@@ -3823,13 +4694,28 @@
           <w:b/>
           <w:bCs/>
         </w:rPr>
-        <w:t xml:space="preserve">Memorija i CPU.</w:t>
-      </w:r>
-      <w:r>
-        <w:t xml:space="preserve"> </w:t>
-      </w:r>
-      <w:r>
-        <w:t xml:space="preserve">JVM-bazirani brokeri, page-cache za log, kompresija/replikacija i koordinacija (KRaft kontroler) troše znatno više RAM-a i CPU-a nego MQTT broker. Realno se računa sa stotinama MB do GB RAM-a po brokeru.</w:t>
+        <w:t xml:space="preserve">Eksperimentalni podaci</w:t>
+      </w:r>
+      <w:r>
+        <w:t xml:space="preserve"> </w:t>
+      </w:r>
+      <w:r>
+        <w:t xml:space="preserve">—</w:t>
+      </w:r>
+      <w:r>
+        <w:t xml:space="preserve"> </w:t>
+      </w:r>
+      <w:r>
+        <w:rPr>
+          <w:rStyle w:val="VerbatimChar"/>
+        </w:rPr>
+        <w:t xml:space="preserve">benchmarks/results/</w:t>
+      </w:r>
+      <w:r>
+        <w:t xml:space="preserve"> </w:t>
+      </w:r>
+      <w:r>
+        <w:t xml:space="preserve">(CSV summary, stats, logovi).</w:t>
       </w:r>
     </w:p>
     <w:p>
@@ -3837,430 +4723,7 @@
         <w:pStyle w:val="Compact"/>
         <w:numPr>
           <w:ilvl w:val="0"/>
-          <w:numId w:val="1009"/>
-        </w:numPr>
-      </w:pPr>
-      <w:r>
-        <w:rPr>
-          <w:b/>
-          <w:bCs/>
-        </w:rPr>
-        <w:t xml:space="preserve">Disk I/O i prostor.</w:t>
-      </w:r>
-      <w:r>
-        <w:t xml:space="preserve"> </w:t>
-      </w:r>
-      <w:r>
-        <w:t xml:space="preserve">Trajni log po definiciji troši disk; visok throughput zahteva brz I/O podsistem.</w:t>
-      </w:r>
-    </w:p>
-    <w:p>
-      <w:pPr>
-        <w:pStyle w:val="Compact"/>
-        <w:numPr>
-          <w:ilvl w:val="0"/>
-          <w:numId w:val="1009"/>
-        </w:numPr>
-      </w:pPr>
-      <w:r>
-        <w:rPr>
-          <w:b/>
-          <w:bCs/>
-        </w:rPr>
-        <w:t xml:space="preserve">Operativna složenost.</w:t>
-      </w:r>
-      <w:r>
-        <w:t xml:space="preserve"> </w:t>
-      </w:r>
-      <w:r>
-        <w:t xml:space="preserve">Particionисање, replikacija, retencija, monitoring lag-a — više konfiguracije i održavanja nego kod MQTT-a.</w:t>
-      </w:r>
-    </w:p>
-    <w:p>
-      <w:pPr>
-        <w:pStyle w:val="FirstParagraph"/>
-      </w:pPr>
-      <w:r>
-        <w:rPr>
-          <w:b/>
-          <w:bCs/>
-        </w:rPr>
-        <w:t xml:space="preserve">Da li je realno na ograničenom edge hardveru?</w:t>
-      </w:r>
-      <w:r>
-        <w:t xml:space="preserve"> </w:t>
-      </w:r>
-      <w:r>
-        <w:t xml:space="preserve">Uglavnom</w:t>
-      </w:r>
-      <w:r>
-        <w:t xml:space="preserve"> </w:t>
-      </w:r>
-      <w:r>
-        <w:rPr>
-          <w:b/>
-          <w:bCs/>
-        </w:rPr>
-        <w:t xml:space="preserve">ne</w:t>
-      </w:r>
-      <w:r>
-        <w:t xml:space="preserve"> </w:t>
-      </w:r>
-      <w:r>
-        <w:t xml:space="preserve">kao puni broker. Iako KRaft režim uklanja ZooKeeper i smanjuje otisak, Kafka i dalje očekuje JVM, disk i RAM koje tipičan senzor/mikrokontroler nema. Na jačim edge</w:t>
-      </w:r>
-      <w:r>
-        <w:t xml:space="preserve"> </w:t>
-      </w:r>
-      <w:r>
-        <w:rPr>
-          <w:i/>
-          <w:iCs/>
-        </w:rPr>
-        <w:t xml:space="preserve">gateway</w:t>
-      </w:r>
-      <w:r>
-        <w:t xml:space="preserve">-ima (npr. industrijski PC) jeste izvodljiva, ali na pravom</w:t>
-      </w:r>
-      <w:r>
-        <w:t xml:space="preserve"> </w:t>
-      </w:r>
-      <w:r>
-        <w:rPr>
-          <w:i/>
-          <w:iCs/>
-        </w:rPr>
-        <w:t xml:space="preserve">constrained</w:t>
-      </w:r>
-      <w:r>
-        <w:t xml:space="preserve"> </w:t>
-      </w:r>
-      <w:r>
-        <w:t xml:space="preserve">hardveru se umesto toga koristi MQTT do ivice, a Kafka u cloud-u/regionalnom čvorištu (često uz MQTT→Kafka most). To je upravo arhitektonski</w:t>
-      </w:r>
-      <w:r>
-        <w:t xml:space="preserve"> </w:t>
-      </w:r>
-      <w:r>
-        <w:rPr>
-          <w:i/>
-          <w:iCs/>
-        </w:rPr>
-        <w:t xml:space="preserve">trade-off</w:t>
-      </w:r>
-      <w:r>
-        <w:t xml:space="preserve"> </w:t>
-      </w:r>
-      <w:r>
-        <w:t xml:space="preserve">koji ovaj projekat ilustruje.</w:t>
-      </w:r>
-    </w:p>
-    <w:bookmarkEnd w:id="24"/>
-    <w:bookmarkStart w:id="25" w:name="pitanje-3--uporedna-tabela-performansi"/>
-    <w:p>
-      <w:pPr>
-        <w:pStyle w:val="Heading3"/>
-      </w:pPr>
-      <w:r>
-        <w:t xml:space="preserve">Pitanje 3 — Uporedna tabela performansi</w:t>
-      </w:r>
-    </w:p>
-    <w:p>
-      <w:pPr>
-        <w:pStyle w:val="FirstParagraph"/>
-      </w:pPr>
-      <w:r>
-        <w:t xml:space="preserve">Vidi</w:t>
-      </w:r>
-      <w:r>
-        <w:t xml:space="preserve"> </w:t>
-      </w:r>
-      <w:r>
-        <w:rPr>
-          <w:b/>
-          <w:bCs/>
-        </w:rPr>
-        <w:t xml:space="preserve">Poglavlje 5.1</w:t>
-      </w:r>
-      <w:r>
-        <w:t xml:space="preserve"> </w:t>
-      </w:r>
-      <w:r>
-        <w:t xml:space="preserve">(popunjeno izmerenim vrednostima). Ključni nalazi: Kafka postiže višestruko veći throughput i bolje skalira (do ~50 900 msg/s pri 1000 uređaja vs ~2 350 msg/s kod MQTT-a), ali po ceni resursa — broker troši **~400–530 MB RAM** i preko 100 % CPU pod opterećenjem, naspram **~2,7 MB RAM** i ~0,06 % CPU kod Mosquitta (≈150× razlika u memoriji). Latencija isporuke kod Kafke raste sa jačinom potvrde (acks=0/1/all → p95 56/148/191 ms). Time je kvantifikovan kompromis: MQTT = minimalni resursi za edge, Kafka = visok throughput i trajnost za cloud uz znatnu resursnu cenu.</w:t>
-      </w:r>
-    </w:p>
-    <w:p>
-      <w:r>
-        <w:pict>
-          <v:rect style="width:0;height:1.5pt" o:hralign="center" o:hrstd="t" o:hr="t"/>
-        </w:pict>
-      </w:r>
-    </w:p>
-    <w:bookmarkEnd w:id="25"/>
-    <w:bookmarkEnd w:id="26"/>
-    <w:bookmarkStart w:id="27" w:name="X683bc926adff3c0499737b934fab7363fdde1f8"/>
-    <w:p>
-      <w:pPr>
-        <w:pStyle w:val="Heading2"/>
-      </w:pPr>
-      <w:r>
-        <w:t xml:space="preserve">7. Zaključak</w:t>
-      </w:r>
-    </w:p>
-    <w:p>
-      <w:pPr>
-        <w:pStyle w:val="FirstParagraph"/>
-      </w:pPr>
-      <w:r>
-        <w:t xml:space="preserve">MQTT i Kafka rešavaju komplementarne probleme.</w:t>
-      </w:r>
-      <w:r>
-        <w:t xml:space="preserve"> </w:t>
-      </w:r>
-      <w:r>
-        <w:rPr>
-          <w:b/>
-          <w:bCs/>
-        </w:rPr>
-        <w:t xml:space="preserve">MQTT</w:t>
-      </w:r>
-      <w:r>
-        <w:t xml:space="preserve"> </w:t>
-      </w:r>
-      <w:r>
-        <w:t xml:space="preserve">je optimalan kao lagani, push transport sa edge uređaja uz fleksibilan QoS i otpornost na loše mreže, ali nije skladište niti platforma za ponovljivu analitiku.</w:t>
-      </w:r>
-      <w:r>
-        <w:t xml:space="preserve"> </w:t>
-      </w:r>
-      <w:r>
-        <w:rPr>
-          <w:b/>
-          <w:bCs/>
-        </w:rPr>
-        <w:t xml:space="preserve">Kafka</w:t>
-      </w:r>
-      <w:r>
-        <w:t xml:space="preserve"> </w:t>
-      </w:r>
-      <w:r>
-        <w:t xml:space="preserve">je trajni, skalabilni log koji dominira u data-intensive cloud obradama, po ceni znatno veće potrošnje resursa i operativne složenosti — što je čini neprikladnom za rad direktno na hardverski ograničenim senzorima. Tipična produkcija ih kombinuje: MQTT do ivice, Kafka u cloud-u. Merenja iz Poglavlja 5 kvantifikuju ovaj kompromis kroz throughput, latenciju, gubitak poruka i potrošnju resursa.</w:t>
-      </w:r>
-    </w:p>
-    <w:p>
-      <w:r>
-        <w:pict>
-          <v:rect style="width:0;height:1.5pt" o:hralign="center" o:hrstd="t" o:hr="t"/>
-        </w:pict>
-      </w:r>
-    </w:p>
-    <w:bookmarkEnd w:id="27"/>
-    <w:bookmarkStart w:id="28" w:name="X282da1c5860271fe9737e50ba924ae7e56c23a8"/>
-    <w:p>
-      <w:pPr>
-        <w:pStyle w:val="Heading2"/>
-      </w:pPr>
-      <w:r>
-        <w:t xml:space="preserve">8. Reprodukcija (isporučeni rezultati projekta)</w:t>
-      </w:r>
-    </w:p>
-    <w:p>
-      <w:pPr>
-        <w:pStyle w:val="Compact"/>
-        <w:numPr>
-          <w:ilvl w:val="0"/>
-          <w:numId w:val="1010"/>
-        </w:numPr>
-      </w:pPr>
-      <w:r>
-        <w:rPr>
-          <w:b/>
-          <w:bCs/>
-        </w:rPr>
-        <w:t xml:space="preserve">Git repo</w:t>
-      </w:r>
-      <w:r>
-        <w:t xml:space="preserve"> </w:t>
-      </w:r>
-      <w:r>
-        <w:t xml:space="preserve">— kompletan izvorni kod i konfiguracija.</w:t>
-      </w:r>
-    </w:p>
-    <w:p>
-      <w:pPr>
-        <w:pStyle w:val="Compact"/>
-        <w:numPr>
-          <w:ilvl w:val="0"/>
-          <w:numId w:val="1010"/>
-        </w:numPr>
-      </w:pPr>
-      <w:r>
-        <w:rPr>
-          <w:b/>
-          <w:bCs/>
-        </w:rPr>
-        <w:t xml:space="preserve">Docker Compose</w:t>
-      </w:r>
-      <w:r>
-        <w:t xml:space="preserve"> </w:t>
-      </w:r>
-      <w:r>
-        <w:t xml:space="preserve">—</w:t>
-      </w:r>
-      <w:r>
-        <w:t xml:space="preserve"> </w:t>
-      </w:r>
-      <w:r>
-        <w:rPr>
-          <w:rStyle w:val="VerbatimChar"/>
-        </w:rPr>
-        <w:t xml:space="preserve">docker-compose.yml</w:t>
-      </w:r>
-      <w:r>
-        <w:t xml:space="preserve"> </w:t>
-      </w:r>
-      <w:r>
-        <w:t xml:space="preserve">(PostgreSQL, Mosquitto, Kafka/KRaft, 6 mikroservisa).</w:t>
-      </w:r>
-    </w:p>
-    <w:p>
-      <w:pPr>
-        <w:pStyle w:val="Compact"/>
-        <w:numPr>
-          <w:ilvl w:val="0"/>
-          <w:numId w:val="1010"/>
-        </w:numPr>
-      </w:pPr>
-      <w:r>
-        <w:rPr>
-          <w:b/>
-          <w:bCs/>
-        </w:rPr>
-        <w:t xml:space="preserve">Konfiguracija brokera</w:t>
-      </w:r>
-      <w:r>
-        <w:t xml:space="preserve"> </w:t>
-      </w:r>
-      <w:r>
-        <w:t xml:space="preserve">—</w:t>
-      </w:r>
-      <w:r>
-        <w:t xml:space="preserve"> </w:t>
-      </w:r>
-      <w:r>
-        <w:rPr>
-          <w:rStyle w:val="VerbatimChar"/>
-        </w:rPr>
-        <w:t xml:space="preserve">mqtt/mosquitto.conf</w:t>
-      </w:r>
-      <w:r>
-        <w:t xml:space="preserve">; Kafka KRaft env u compose-u;</w:t>
-      </w:r>
-      <w:r>
-        <w:t xml:space="preserve"> </w:t>
-      </w:r>
-      <w:r>
-        <w:rPr>
-          <w:rStyle w:val="VerbatimChar"/>
-        </w:rPr>
-        <w:t xml:space="preserve">acks</w:t>
-      </w:r>
-      <w:r>
-        <w:t xml:space="preserve">/</w:t>
-      </w:r>
-      <w:r>
-        <w:rPr>
-          <w:rStyle w:val="VerbatimChar"/>
-        </w:rPr>
-        <w:t xml:space="preserve">QoS</w:t>
-      </w:r>
-      <w:r>
-        <w:t xml:space="preserve"> </w:t>
-      </w:r>
-      <w:r>
-        <w:t xml:space="preserve">parametrizovani.</w:t>
-      </w:r>
-    </w:p>
-    <w:p>
-      <w:pPr>
-        <w:pStyle w:val="Compact"/>
-        <w:numPr>
-          <w:ilvl w:val="0"/>
-          <w:numId w:val="1010"/>
-        </w:numPr>
-      </w:pPr>
-      <w:r>
-        <w:rPr>
-          <w:b/>
-          <w:bCs/>
-        </w:rPr>
-        <w:t xml:space="preserve">Benchmark skripte</w:t>
-      </w:r>
-      <w:r>
-        <w:t xml:space="preserve"> </w:t>
-      </w:r>
-      <w:r>
-        <w:t xml:space="preserve">—</w:t>
-      </w:r>
-      <w:r>
-        <w:t xml:space="preserve"> </w:t>
-      </w:r>
-      <w:r>
-        <w:rPr>
-          <w:rStyle w:val="VerbatimChar"/>
-        </w:rPr>
-        <w:t xml:space="preserve">benchmarks/scripts/</w:t>
-      </w:r>
-      <w:r>
-        <w:t xml:space="preserve"> </w:t>
-      </w:r>
-      <w:r>
-        <w:t xml:space="preserve">(scenariji A–D, oba brokera, nativni alati).</w:t>
-      </w:r>
-    </w:p>
-    <w:p>
-      <w:pPr>
-        <w:pStyle w:val="Compact"/>
-        <w:numPr>
-          <w:ilvl w:val="0"/>
-          <w:numId w:val="1010"/>
-        </w:numPr>
-      </w:pPr>
-      <w:r>
-        <w:rPr>
-          <w:b/>
-          <w:bCs/>
-        </w:rPr>
-        <w:t xml:space="preserve">Eksperimentalni podaci</w:t>
-      </w:r>
-      <w:r>
-        <w:t xml:space="preserve"> </w:t>
-      </w:r>
-      <w:r>
-        <w:t xml:space="preserve">—</w:t>
-      </w:r>
-      <w:r>
-        <w:t xml:space="preserve"> </w:t>
-      </w:r>
-      <w:r>
-        <w:rPr>
-          <w:rStyle w:val="VerbatimChar"/>
-        </w:rPr>
-        <w:t xml:space="preserve">benchmarks/results/</w:t>
-      </w:r>
-      <w:r>
-        <w:t xml:space="preserve"> </w:t>
-      </w:r>
-      <w:r>
-        <w:t xml:space="preserve">(CSV summary, stats, logovi).</w:t>
-      </w:r>
-    </w:p>
-    <w:p>
-      <w:pPr>
-        <w:pStyle w:val="Compact"/>
-        <w:numPr>
-          <w:ilvl w:val="0"/>
-          <w:numId w:val="1010"/>
+          <w:numId w:val="1008"/>
         </w:numPr>
       </w:pPr>
       <w:r>
@@ -4709,12 +5172,6 @@
     <w:abstractNumId w:val="991"/>
   </w:num>
   <w:num w:numId="1008">
-    <w:abstractNumId w:val="991"/>
-  </w:num>
-  <w:num w:numId="1009">
-    <w:abstractNumId w:val="991"/>
-  </w:num>
-  <w:num w:numId="1010">
     <w:abstractNumId w:val="99411"/>
     <w:lvlOverride w:ilvl="0">
       <w:startOverride w:val="1"/>
@@ -4755,7 +5212,7 @@
         <w:rFonts w:asciiTheme="minorHAnsi" w:cstheme="minorBidi" w:eastAsiaTheme="minorEastAsia" w:hAnsiTheme="minorHAnsi"/>
         <w:sz w:val="24"/>
         <w:szCs w:val="24"/>
-        <w:lang w:bidi="ar-SA" w:eastAsia="zh-CN" w:val="sr"/>
+        <w:lang w:bidi="ar-SA" w:eastAsia="zh-CN" w:val="en-US"/>
       </w:rPr>
     </w:rPrDefault>
     <w:pPrDefault>

</xml_diff>